<commit_message>
Finished Vignere cipher, have to do Vernam cipher next.
</commit_message>
<xml_diff>
--- a/Week-1/Ex1a_23BCE1145_Vishwajith.docx
+++ b/Week-1/Ex1a_23BCE1145_Vishwajith.docx
@@ -288,7 +288,16 @@
         <w:jc w:val="center"/>
       </w:pPr>
       <w:r>
-        <w:t>Week 1 – Caesar Cipher</w:t>
+        <w:t>Week 1 –</w:t>
+      </w:r>
+      <w:r>
+        <w:t xml:space="preserve"> C</w:t>
+      </w:r>
+      <w:r>
+        <w:t>ipher</w:t>
+      </w:r>
+      <w:r>
+        <w:t xml:space="preserve"> techniques</w:t>
       </w:r>
     </w:p>
     <w:p>
@@ -296,7 +305,13 @@
         <w:pStyle w:val="Heading1"/>
       </w:pPr>
       <w:r>
-        <w:t>Code:</w:t>
+        <w:t>Code</w:t>
+      </w:r>
+      <w:r>
+        <w:t xml:space="preserve"> (Caesar Cipher)</w:t>
+      </w:r>
+      <w:r>
+        <w:t>:</w:t>
       </w:r>
     </w:p>
     <w:p>
@@ -1733,7 +1748,13 @@
       </w:pPr>
       <w:r>
         <w:lastRenderedPageBreak/>
-        <w:t>Output:</w:t>
+        <w:t>Output</w:t>
+      </w:r>
+      <w:r>
+        <w:t xml:space="preserve"> (Caesar Cipher)</w:t>
+      </w:r>
+      <w:r>
+        <w:t>:</w:t>
       </w:r>
     </w:p>
     <w:p>
@@ -1746,6 +1767,9 @@
     </w:p>
     <w:p>
       <w:r>
+        <w:rPr>
+          <w:noProof/>
+        </w:rPr>
         <w:drawing>
           <wp:inline distT="0" distB="0" distL="0" distR="0" wp14:anchorId="4F4E10B6" wp14:editId="5817EDEC">
             <wp:extent cx="5731510" cy="2945130"/>
@@ -1793,6 +1817,9 @@
     </w:p>
     <w:p>
       <w:r>
+        <w:rPr>
+          <w:noProof/>
+        </w:rPr>
         <w:drawing>
           <wp:inline distT="0" distB="0" distL="0" distR="0" wp14:anchorId="244A7E07" wp14:editId="22A31A5E">
             <wp:extent cx="5731510" cy="2945130"/>
@@ -2375,6 +2402,7 @@
   <w:style w:type="character" w:default="1" w:styleId="DefaultParagraphFont">
     <w:name w:val="Default Paragraph Font"/>
     <w:uiPriority w:val="1"/>
+    <w:semiHidden/>
     <w:unhideWhenUsed/>
   </w:style>
   <w:style w:type="table" w:default="1" w:styleId="TableNormal">
@@ -2777,23 +2805,6 @@
 </file>
 
 <file path=customXml/item1.xml><?xml version="1.0" encoding="utf-8"?>
-<?mso-contentType ?>
-<FormTemplates xmlns="http://schemas.microsoft.com/sharepoint/v3/contenttype/forms">
-  <Display>DocumentLibraryForm</Display>
-  <Edit>DocumentLibraryForm</Edit>
-  <New>DocumentLibraryForm</New>
-</FormTemplates>
-</file>
-
-<file path=customXml/item2.xml><?xml version="1.0" encoding="utf-8"?>
-<p:properties xmlns:p="http://schemas.microsoft.com/office/2006/metadata/properties" xmlns:xsi="http://www.w3.org/2001/XMLSchema-instance" xmlns:pc="http://schemas.microsoft.com/office/infopath/2007/PartnerControls">
-  <documentManagement>
-    <ReferenceId xmlns="7d434318-ea68-484d-9b90-48e8ff59ee73" xsi:nil="true"/>
-  </documentManagement>
-</p:properties>
-</file>
-
-<file path=customXml/item3.xml><?xml version="1.0" encoding="utf-8"?>
 <ct:contentTypeSchema xmlns:ct="http://schemas.microsoft.com/office/2006/metadata/contentType" xmlns:ma="http://schemas.microsoft.com/office/2006/metadata/properties/metaAttributes" ct:_="" ma:_="" ma:contentTypeName="Document" ma:contentTypeID="0x01010016A77D0581D4CF4BBDA8A43453351EEE" ma:contentTypeVersion="1" ma:contentTypeDescription="Create a new document." ma:contentTypeScope="" ma:versionID="588eae25f797714dab30afb38b1467bb">
   <xsd:schema xmlns:xsd="http://www.w3.org/2001/XMLSchema" xmlns:xs="http://www.w3.org/2001/XMLSchema" xmlns:p="http://schemas.microsoft.com/office/2006/metadata/properties" xmlns:ns2="7d434318-ea68-484d-9b90-48e8ff59ee73" targetNamespace="http://schemas.microsoft.com/office/2006/metadata/properties" ma:root="true" ma:fieldsID="9820101d4f4e47628ef13eef411db721" ns2:_="">
     <xsd:import namespace="7d434318-ea68-484d-9b90-48e8ff59ee73"/>
@@ -2919,10 +2930,37 @@
 </ct:contentTypeSchema>
 </file>
 
+<file path=customXml/item2.xml><?xml version="1.0" encoding="utf-8"?>
+<p:properties xmlns:p="http://schemas.microsoft.com/office/2006/metadata/properties" xmlns:xsi="http://www.w3.org/2001/XMLSchema-instance" xmlns:pc="http://schemas.microsoft.com/office/infopath/2007/PartnerControls">
+  <documentManagement>
+    <ReferenceId xmlns="7d434318-ea68-484d-9b90-48e8ff59ee73" xsi:nil="true"/>
+  </documentManagement>
+</p:properties>
+</file>
+
+<file path=customXml/item3.xml><?xml version="1.0" encoding="utf-8"?>
+<?mso-contentType ?>
+<FormTemplates xmlns="http://schemas.microsoft.com/sharepoint/v3/contenttype/forms">
+  <Display>DocumentLibraryForm</Display>
+  <Edit>DocumentLibraryForm</Edit>
+  <New>DocumentLibraryForm</New>
+</FormTemplates>
+</file>
+
 <file path=customXml/itemProps1.xml><?xml version="1.0" encoding="utf-8"?>
-<ds:datastoreItem xmlns:ds="http://schemas.openxmlformats.org/officeDocument/2006/customXml" ds:itemID="{5DBD1E01-457F-4917-A8A5-5F7A84E8FDC3}">
+<ds:datastoreItem xmlns:ds="http://schemas.openxmlformats.org/officeDocument/2006/customXml" ds:itemID="{3063C5FB-61D2-4522-91D9-4FCC2B80A578}">
   <ds:schemaRefs>
-    <ds:schemaRef ds:uri="http://schemas.microsoft.com/sharepoint/v3/contenttype/forms"/>
+    <ds:schemaRef ds:uri="http://schemas.microsoft.com/office/2006/metadata/contentType"/>
+    <ds:schemaRef ds:uri="http://schemas.microsoft.com/office/2006/metadata/properties/metaAttributes"/>
+    <ds:schemaRef ds:uri="http://www.w3.org/2001/XMLSchema"/>
+    <ds:schemaRef ds:uri="http://schemas.microsoft.com/office/2006/metadata/properties"/>
+    <ds:schemaRef ds:uri="7d434318-ea68-484d-9b90-48e8ff59ee73"/>
+    <ds:schemaRef ds:uri="http://schemas.microsoft.com/office/2006/documentManagement/types"/>
+    <ds:schemaRef ds:uri="http://schemas.microsoft.com/office/infopath/2007/PartnerControls"/>
+    <ds:schemaRef ds:uri="http://schemas.openxmlformats.org/package/2006/metadata/core-properties"/>
+    <ds:schemaRef ds:uri="http://purl.org/dc/elements/1.1/"/>
+    <ds:schemaRef ds:uri="http://purl.org/dc/terms/"/>
+    <ds:schemaRef ds:uri="http://schemas.microsoft.com/internal/obd"/>
   </ds:schemaRefs>
 </ds:datastoreItem>
 </file>
@@ -2938,19 +2976,9 @@
 </file>
 
 <file path=customXml/itemProps3.xml><?xml version="1.0" encoding="utf-8"?>
-<ds:datastoreItem xmlns:ds="http://schemas.openxmlformats.org/officeDocument/2006/customXml" ds:itemID="{3063C5FB-61D2-4522-91D9-4FCC2B80A578}">
+<ds:datastoreItem xmlns:ds="http://schemas.openxmlformats.org/officeDocument/2006/customXml" ds:itemID="{5DBD1E01-457F-4917-A8A5-5F7A84E8FDC3}">
   <ds:schemaRefs>
-    <ds:schemaRef ds:uri="http://schemas.microsoft.com/office/2006/metadata/contentType"/>
-    <ds:schemaRef ds:uri="http://schemas.microsoft.com/office/2006/metadata/properties/metaAttributes"/>
-    <ds:schemaRef ds:uri="http://www.w3.org/2001/XMLSchema"/>
-    <ds:schemaRef ds:uri="http://schemas.microsoft.com/office/2006/metadata/properties"/>
-    <ds:schemaRef ds:uri="7d434318-ea68-484d-9b90-48e8ff59ee73"/>
-    <ds:schemaRef ds:uri="http://schemas.microsoft.com/office/2006/documentManagement/types"/>
-    <ds:schemaRef ds:uri="http://schemas.microsoft.com/office/infopath/2007/PartnerControls"/>
-    <ds:schemaRef ds:uri="http://schemas.openxmlformats.org/package/2006/metadata/core-properties"/>
-    <ds:schemaRef ds:uri="http://purl.org/dc/elements/1.1/"/>
-    <ds:schemaRef ds:uri="http://purl.org/dc/terms/"/>
-    <ds:schemaRef ds:uri="http://schemas.microsoft.com/internal/obd"/>
+    <ds:schemaRef ds:uri="http://schemas.microsoft.com/sharepoint/v3/contenttype/forms"/>
   </ds:schemaRefs>
 </ds:datastoreItem>
 </file>
</xml_diff>

<commit_message>
Finished Vernam Cipher too last week. Forgot to commit.
</commit_message>
<xml_diff>
--- a/Week-1/Ex1a_23BCE1145_Vishwajith.docx
+++ b/Week-1/Ex1a_23BCE1145_Vishwajith.docx
@@ -288,16 +288,7 @@
         <w:jc w:val="center"/>
       </w:pPr>
       <w:r>
-        <w:t>Week 1 –</w:t>
-      </w:r>
-      <w:r>
-        <w:t xml:space="preserve"> C</w:t>
-      </w:r>
-      <w:r>
-        <w:t>ipher</w:t>
-      </w:r>
-      <w:r>
-        <w:t xml:space="preserve"> techniques</w:t>
+        <w:t>EX1A – Classical Cryptographic Techniques</w:t>
       </w:r>
     </w:p>
     <w:p>
@@ -569,6 +560,7 @@
     </w:p>
     <w:p>
       <w:r>
+        <w:lastRenderedPageBreak/>
         <w:t xml:space="preserve">    String caesarEncrypt(String </w:t>
       </w:r>
       <w:r>
@@ -604,7 +596,6 @@
     </w:p>
     <w:p>
       <w:r>
-        <w:lastRenderedPageBreak/>
         <w:t xml:space="preserve">        StringBuilder ct = </w:t>
       </w:r>
       <w:r>
@@ -915,12 +906,12 @@
     </w:p>
     <w:p>
       <w:r>
+        <w:lastRenderedPageBreak/>
         <w:t>            output.writeInt(k);</w:t>
       </w:r>
     </w:p>
     <w:p>
       <w:r>
-        <w:lastRenderedPageBreak/>
         <w:t>            output.writeUTF(cts);</w:t>
       </w:r>
     </w:p>
@@ -1204,6 +1195,7 @@
     </w:p>
     <w:p>
       <w:r>
+        <w:lastRenderedPageBreak/>
         <w:t xml:space="preserve">        } catch (UnknownHostException </w:t>
       </w:r>
       <w:r>
@@ -1219,7 +1211,6 @@
     </w:p>
     <w:p>
       <w:r>
-        <w:lastRenderedPageBreak/>
         <w:t>            System.out.println(u);</w:t>
       </w:r>
     </w:p>
@@ -1540,6 +1531,7 @@
     </w:p>
     <w:p>
       <w:r>
+        <w:lastRenderedPageBreak/>
         <w:t xml:space="preserve">    public </w:t>
       </w:r>
       <w:r>
@@ -1555,7 +1547,6 @@
     </w:p>
     <w:p>
       <w:r>
-        <w:lastRenderedPageBreak/>
         <w:t>        try {</w:t>
       </w:r>
     </w:p>
@@ -1859,6 +1850,7 @@
     </w:p>
     <w:p>
       <w:pPr>
+        <w:spacing w:line="259" w:lineRule="auto"/>
         <w:rPr>
           <w:rFonts w:ascii="Times New Roman" w:hAnsi="Times New Roman" w:cs="Times New Roman"/>
           <w:sz w:val="28"/>
@@ -1871,76 +1863,3298 @@
           <w:sz w:val="28"/>
           <w:szCs w:val="28"/>
         </w:rPr>
-        <w:t>File name</w:t>
+        <w:br w:type="page"/>
       </w:r>
     </w:p>
     <w:p>
       <w:pPr>
-        <w:rPr>
-          <w:rFonts w:ascii="Times New Roman" w:hAnsi="Times New Roman" w:cs="Times New Roman"/>
-          <w:sz w:val="28"/>
-          <w:szCs w:val="28"/>
-        </w:rPr>
+        <w:pStyle w:val="Heading1"/>
       </w:pPr>
       <w:r>
-        <w:rPr>
-          <w:rFonts w:ascii="Times New Roman" w:hAnsi="Times New Roman" w:cs="Times New Roman"/>
-          <w:sz w:val="28"/>
-          <w:szCs w:val="28"/>
-        </w:rPr>
-        <w:t>Ex1</w:t>
-      </w:r>
-      <w:r>
-        <w:rPr>
-          <w:rFonts w:ascii="Times New Roman" w:hAnsi="Times New Roman" w:cs="Times New Roman"/>
-          <w:sz w:val="28"/>
-          <w:szCs w:val="28"/>
-        </w:rPr>
-        <w:t>a</w:t>
-      </w:r>
-      <w:r>
-        <w:rPr>
-          <w:rFonts w:ascii="Times New Roman" w:hAnsi="Times New Roman" w:cs="Times New Roman"/>
-          <w:sz w:val="28"/>
-          <w:szCs w:val="28"/>
-        </w:rPr>
+        <w:lastRenderedPageBreak/>
+        <w:t>Code (Vigenère Cipher):</w:t>
+      </w:r>
+    </w:p>
+    <w:p>
+      <w:pPr>
+        <w:pStyle w:val="Heading2"/>
+      </w:pPr>
+      <w:r>
+        <w:t>Sender:</w:t>
+      </w:r>
+    </w:p>
+    <w:p>
+      <w:r>
+        <w:t>import java.util.</w:t>
+      </w:r>
+      <w:r>
+        <w:rPr>
+          <w:i/>
+          <w:iCs/>
+        </w:rPr>
+        <w:t>*</w:t>
+      </w:r>
+      <w:r>
+        <w:t>;</w:t>
+      </w:r>
+    </w:p>
+    <w:p>
+      <w:r>
+        <w:t>import java.io.</w:t>
+      </w:r>
+      <w:r>
+        <w:rPr>
+          <w:i/>
+          <w:iCs/>
+        </w:rPr>
+        <w:t>*</w:t>
+      </w:r>
+      <w:r>
+        <w:t>;</w:t>
+      </w:r>
+    </w:p>
+    <w:p>
+      <w:r>
+        <w:t>import java.net.</w:t>
+      </w:r>
+      <w:r>
+        <w:rPr>
+          <w:i/>
+          <w:iCs/>
+        </w:rPr>
+        <w:t>*</w:t>
+      </w:r>
+      <w:r>
+        <w:t>;</w:t>
+      </w:r>
+    </w:p>
+    <w:p/>
+    <w:p>
+      <w:r>
+        <w:t>public class Vignere_Sender {</w:t>
+      </w:r>
+    </w:p>
+    <w:p>
+      <w:r>
+        <w:t>    private Socket socket = null;</w:t>
+      </w:r>
+    </w:p>
+    <w:p>
+      <w:r>
+        <w:t>    private DataInputStream input = null;</w:t>
+      </w:r>
+    </w:p>
+    <w:p>
+      <w:r>
+        <w:t>    private DataOutputStream output = null;</w:t>
+      </w:r>
+    </w:p>
+    <w:p>
+      <w:r>
+        <w:t>    private Scanner sc = null;</w:t>
+      </w:r>
+    </w:p>
+    <w:p>
+      <w:r>
+        <w:t xml:space="preserve">    </w:t>
+      </w:r>
+      <w:r>
+        <w:rPr>
+          <w:i/>
+          <w:iCs/>
+        </w:rPr>
+        <w:t>int</w:t>
+      </w:r>
+      <w:r>
+        <w:t xml:space="preserve"> pos = 0;</w:t>
+      </w:r>
+    </w:p>
+    <w:p/>
+    <w:p>
+      <w:r>
+        <w:t xml:space="preserve">    public Vignere_Sender(String </w:t>
+      </w:r>
+      <w:r>
+        <w:rPr>
+          <w:i/>
+          <w:iCs/>
+        </w:rPr>
+        <w:t>address</w:t>
+      </w:r>
+      <w:r>
+        <w:t xml:space="preserve">, </w:t>
+      </w:r>
+      <w:r>
+        <w:rPr>
+          <w:i/>
+          <w:iCs/>
+        </w:rPr>
+        <w:t>int</w:t>
+      </w:r>
+      <w:r>
         <w:t xml:space="preserve"> </w:t>
       </w:r>
       <w:r>
         <w:rPr>
-          <w:rFonts w:ascii="Times New Roman" w:hAnsi="Times New Roman" w:cs="Times New Roman"/>
-          <w:sz w:val="28"/>
-          <w:szCs w:val="28"/>
-        </w:rPr>
-        <w:t>_</w:t>
-      </w:r>
-      <w:r>
-        <w:rPr>
-          <w:rFonts w:ascii="Times New Roman" w:hAnsi="Times New Roman" w:cs="Times New Roman"/>
-          <w:sz w:val="28"/>
-          <w:szCs w:val="28"/>
-        </w:rPr>
-        <w:t>REGNO_NAME</w:t>
-      </w:r>
-      <w:r>
-        <w:rPr>
-          <w:rFonts w:ascii="Times New Roman" w:hAnsi="Times New Roman" w:cs="Times New Roman"/>
-          <w:sz w:val="28"/>
-          <w:szCs w:val="28"/>
-        </w:rPr>
-        <w:t>.pdf</w:t>
+          <w:i/>
+          <w:iCs/>
+        </w:rPr>
+        <w:t>port</w:t>
+      </w:r>
+      <w:r>
+        <w:t>) {</w:t>
+      </w:r>
+    </w:p>
+    <w:p>
+      <w:r>
+        <w:t>        try {</w:t>
+      </w:r>
+    </w:p>
+    <w:p>
+      <w:r>
+        <w:t xml:space="preserve">            socket = </w:t>
+      </w:r>
+      <w:r>
+        <w:rPr>
+          <w:b/>
+          <w:bCs/>
+        </w:rPr>
+        <w:t>new</w:t>
+      </w:r>
+      <w:r>
+        <w:t xml:space="preserve"> Socket(</w:t>
+      </w:r>
+      <w:r>
+        <w:rPr>
+          <w:i/>
+          <w:iCs/>
+        </w:rPr>
+        <w:t>address</w:t>
+      </w:r>
+      <w:r>
+        <w:t xml:space="preserve">, </w:t>
+      </w:r>
+      <w:r>
+        <w:rPr>
+          <w:i/>
+          <w:iCs/>
+        </w:rPr>
+        <w:t>port</w:t>
+      </w:r>
+      <w:r>
+        <w:t>);</w:t>
+      </w:r>
+    </w:p>
+    <w:p>
+      <w:r>
+        <w:t>            System.out.println("Client is connected!");</w:t>
+      </w:r>
+    </w:p>
+    <w:p>
+      <w:r>
+        <w:t xml:space="preserve">            input = </w:t>
+      </w:r>
+      <w:r>
+        <w:rPr>
+          <w:b/>
+          <w:bCs/>
+        </w:rPr>
+        <w:t>new</w:t>
+      </w:r>
+      <w:r>
+        <w:t xml:space="preserve"> DataInputStream(socket.getInputStream());</w:t>
+      </w:r>
+    </w:p>
+    <w:p>
+      <w:r>
+        <w:t xml:space="preserve">            output = </w:t>
+      </w:r>
+      <w:r>
+        <w:rPr>
+          <w:b/>
+          <w:bCs/>
+        </w:rPr>
+        <w:t>new</w:t>
+      </w:r>
+      <w:r>
+        <w:t xml:space="preserve"> DataOutputStream(socket.getOutputStream());</w:t>
+      </w:r>
+    </w:p>
+    <w:p>
+      <w:r>
+        <w:t xml:space="preserve">            sc = </w:t>
+      </w:r>
+      <w:r>
+        <w:rPr>
+          <w:b/>
+          <w:bCs/>
+        </w:rPr>
+        <w:t>new</w:t>
+      </w:r>
+      <w:r>
+        <w:t xml:space="preserve"> Scanner(System.in);</w:t>
+      </w:r>
+    </w:p>
+    <w:p>
+      <w:r>
+        <w:t xml:space="preserve">        } catch (UnknownHostException </w:t>
+      </w:r>
+      <w:r>
+        <w:rPr>
+          <w:i/>
+          <w:iCs/>
+        </w:rPr>
+        <w:t>u</w:t>
+      </w:r>
+      <w:r>
+        <w:t>) {</w:t>
+      </w:r>
+    </w:p>
+    <w:p>
+      <w:r>
+        <w:t>            System.out.println(u);</w:t>
+      </w:r>
+    </w:p>
+    <w:p>
+      <w:r>
+        <w:t xml:space="preserve">        } catch (IOException </w:t>
+      </w:r>
+      <w:r>
+        <w:rPr>
+          <w:i/>
+          <w:iCs/>
+        </w:rPr>
+        <w:t>i</w:t>
+      </w:r>
+      <w:r>
+        <w:t>) {</w:t>
+      </w:r>
+    </w:p>
+    <w:p>
+      <w:r>
+        <w:t>            System.out.println(i);</w:t>
+      </w:r>
+    </w:p>
+    <w:p>
+      <w:r>
+        <w:t>        }</w:t>
+      </w:r>
+    </w:p>
+    <w:p>
+      <w:r>
+        <w:t>    }</w:t>
+      </w:r>
+    </w:p>
+    <w:p/>
+    <w:p>
+      <w:r>
+        <w:t xml:space="preserve">    String vignereEncrpyt(String </w:t>
+      </w:r>
+      <w:r>
+        <w:rPr>
+          <w:i/>
+          <w:iCs/>
+        </w:rPr>
+        <w:t>pt</w:t>
+      </w:r>
+      <w:r>
+        <w:t xml:space="preserve">, String </w:t>
+      </w:r>
+      <w:r>
+        <w:rPr>
+          <w:i/>
+          <w:iCs/>
+        </w:rPr>
+        <w:t>k</w:t>
+      </w:r>
+      <w:r>
+        <w:t>) {</w:t>
+      </w:r>
+    </w:p>
+    <w:p>
+      <w:r>
+        <w:t xml:space="preserve">        StringBuilder ct = </w:t>
+      </w:r>
+      <w:r>
+        <w:rPr>
+          <w:b/>
+          <w:bCs/>
+        </w:rPr>
+        <w:t>new</w:t>
+      </w:r>
+      <w:r>
+        <w:t xml:space="preserve"> StringBuilder();</w:t>
+      </w:r>
+    </w:p>
+    <w:p>
+      <w:r>
+        <w:t xml:space="preserve">        </w:t>
+      </w:r>
+      <w:r>
+        <w:rPr>
+          <w:i/>
+          <w:iCs/>
+        </w:rPr>
+        <w:t>int</w:t>
+      </w:r>
+      <w:r>
+        <w:t xml:space="preserve"> klen = </w:t>
+      </w:r>
+      <w:r>
+        <w:rPr>
+          <w:i/>
+          <w:iCs/>
+        </w:rPr>
+        <w:t>k</w:t>
+      </w:r>
+      <w:r>
+        <w:t>.length();</w:t>
+      </w:r>
+    </w:p>
+    <w:p/>
+    <w:p>
+      <w:r>
+        <w:lastRenderedPageBreak/>
+        <w:t>        for (</w:t>
+      </w:r>
+      <w:r>
+        <w:rPr>
+          <w:i/>
+          <w:iCs/>
+        </w:rPr>
+        <w:t>char</w:t>
+      </w:r>
+      <w:r>
+        <w:t xml:space="preserve"> c : </w:t>
+      </w:r>
+      <w:r>
+        <w:rPr>
+          <w:i/>
+          <w:iCs/>
+        </w:rPr>
+        <w:t>pt</w:t>
+      </w:r>
+      <w:r>
+        <w:t>.toCharArray()) {</w:t>
+      </w:r>
+    </w:p>
+    <w:p>
+      <w:r>
+        <w:t xml:space="preserve">            </w:t>
+      </w:r>
+      <w:r>
+        <w:rPr>
+          <w:i/>
+          <w:iCs/>
+        </w:rPr>
+        <w:t>char</w:t>
+      </w:r>
+      <w:r>
+        <w:t xml:space="preserve"> keyChar = </w:t>
+      </w:r>
+      <w:r>
+        <w:rPr>
+          <w:i/>
+          <w:iCs/>
+        </w:rPr>
+        <w:t>k</w:t>
+      </w:r>
+      <w:r>
+        <w:t>.charAt(pos);</w:t>
+      </w:r>
+    </w:p>
+    <w:p>
+      <w:r>
+        <w:t xml:space="preserve">            </w:t>
+      </w:r>
+      <w:r>
+        <w:rPr>
+          <w:i/>
+          <w:iCs/>
+        </w:rPr>
+        <w:t>int</w:t>
+      </w:r>
+      <w:r>
+        <w:t xml:space="preserve"> shift;</w:t>
+      </w:r>
+    </w:p>
+    <w:p>
+      <w:r>
+        <w:t>            if (Character.isUpperCase(keyChar)) {</w:t>
+      </w:r>
+    </w:p>
+    <w:p>
+      <w:r>
+        <w:t>                shift = keyChar - 'A';</w:t>
+      </w:r>
+    </w:p>
+    <w:p>
+      <w:r>
+        <w:t>            } else {</w:t>
+      </w:r>
+    </w:p>
+    <w:p>
+      <w:r>
+        <w:t>                shift = keyChar - 'a';</w:t>
+      </w:r>
+    </w:p>
+    <w:p>
+      <w:r>
+        <w:t>            }</w:t>
+      </w:r>
+    </w:p>
+    <w:p/>
+    <w:p>
+      <w:r>
+        <w:t>            if (Character.isUpperCase(c)) {</w:t>
+      </w:r>
+    </w:p>
+    <w:p>
+      <w:r>
+        <w:t xml:space="preserve">                </w:t>
+      </w:r>
+      <w:r>
+        <w:rPr>
+          <w:i/>
+          <w:iCs/>
+        </w:rPr>
+        <w:t>int</w:t>
+      </w:r>
+      <w:r>
+        <w:t xml:space="preserve"> ch = (</w:t>
+      </w:r>
+      <w:r>
+        <w:rPr>
+          <w:i/>
+          <w:iCs/>
+        </w:rPr>
+        <w:t>int</w:t>
+      </w:r>
+      <w:r>
+        <w:t>) c - 'A';</w:t>
+      </w:r>
+    </w:p>
+    <w:p>
+      <w:r>
+        <w:t>                ch = (ch + shift) % 26;</w:t>
+      </w:r>
+    </w:p>
+    <w:p>
+      <w:r>
+        <w:t xml:space="preserve">                </w:t>
+      </w:r>
+      <w:r>
+        <w:rPr>
+          <w:i/>
+          <w:iCs/>
+        </w:rPr>
+        <w:t>char</w:t>
+      </w:r>
+      <w:r>
+        <w:t xml:space="preserve"> cs = (</w:t>
+      </w:r>
+      <w:r>
+        <w:rPr>
+          <w:i/>
+          <w:iCs/>
+        </w:rPr>
+        <w:t>char</w:t>
+      </w:r>
+      <w:r>
+        <w:t>) (ch + 65);</w:t>
+      </w:r>
+    </w:p>
+    <w:p>
+      <w:r>
+        <w:t>                ct.append(cs);</w:t>
+      </w:r>
+    </w:p>
+    <w:p>
+      <w:r>
+        <w:t>                pos = (pos + 1) % klen;</w:t>
+      </w:r>
+    </w:p>
+    <w:p>
+      <w:r>
+        <w:t>            } else if (Character.isLowerCase(c)) {</w:t>
+      </w:r>
+    </w:p>
+    <w:p>
+      <w:r>
+        <w:t xml:space="preserve">                </w:t>
+      </w:r>
+      <w:r>
+        <w:rPr>
+          <w:i/>
+          <w:iCs/>
+        </w:rPr>
+        <w:t>int</w:t>
+      </w:r>
+      <w:r>
+        <w:t xml:space="preserve"> ch = (</w:t>
+      </w:r>
+      <w:r>
+        <w:rPr>
+          <w:i/>
+          <w:iCs/>
+        </w:rPr>
+        <w:t>int</w:t>
+      </w:r>
+      <w:r>
+        <w:t>) c - 'a';</w:t>
+      </w:r>
+    </w:p>
+    <w:p>
+      <w:r>
+        <w:t>                ch = (ch + shift) % 26;</w:t>
+      </w:r>
+    </w:p>
+    <w:p>
+      <w:r>
+        <w:t xml:space="preserve">                </w:t>
+      </w:r>
+      <w:r>
+        <w:rPr>
+          <w:i/>
+          <w:iCs/>
+        </w:rPr>
+        <w:t>char</w:t>
+      </w:r>
+      <w:r>
+        <w:t xml:space="preserve"> cs = (</w:t>
+      </w:r>
+      <w:r>
+        <w:rPr>
+          <w:i/>
+          <w:iCs/>
+        </w:rPr>
+        <w:t>char</w:t>
+      </w:r>
+      <w:r>
+        <w:t>) (ch + 97);</w:t>
+      </w:r>
+    </w:p>
+    <w:p>
+      <w:r>
+        <w:t>                ct.append(cs);</w:t>
+      </w:r>
+    </w:p>
+    <w:p>
+      <w:r>
+        <w:t>                pos = (pos + 1) % klen;</w:t>
+      </w:r>
+    </w:p>
+    <w:p>
+      <w:r>
+        <w:t>            } else {</w:t>
+      </w:r>
+    </w:p>
+    <w:p>
+      <w:r>
+        <w:t>                ct.append(c);</w:t>
+      </w:r>
+    </w:p>
+    <w:p>
+      <w:r>
+        <w:t>            }</w:t>
+      </w:r>
+    </w:p>
+    <w:p>
+      <w:r>
+        <w:t>        }</w:t>
+      </w:r>
+    </w:p>
+    <w:p/>
+    <w:p>
+      <w:r>
+        <w:t>        return ct.toString();</w:t>
+      </w:r>
+    </w:p>
+    <w:p>
+      <w:r>
+        <w:t>    }</w:t>
+      </w:r>
+    </w:p>
+    <w:p/>
+    <w:p>
+      <w:r>
+        <w:t xml:space="preserve">    public </w:t>
+      </w:r>
+      <w:r>
+        <w:rPr>
+          <w:i/>
+          <w:iCs/>
+        </w:rPr>
+        <w:t>void</w:t>
+      </w:r>
+      <w:r>
+        <w:t xml:space="preserve"> Work() {</w:t>
+      </w:r>
+    </w:p>
+    <w:p>
+      <w:r>
+        <w:t>        try {</w:t>
+      </w:r>
+    </w:p>
+    <w:p>
+      <w:r>
+        <w:lastRenderedPageBreak/>
+        <w:t>            System.out.print("Enter the message: ");</w:t>
+      </w:r>
+    </w:p>
+    <w:p>
+      <w:r>
+        <w:t>            String[] ips = sc.nextLine().trim().split("\\s+");</w:t>
+      </w:r>
+    </w:p>
+    <w:p>
+      <w:r>
+        <w:t>            System.out.print("Enter the key: ");</w:t>
+      </w:r>
+    </w:p>
+    <w:p>
+      <w:r>
+        <w:t>            String k = sc.next().trim();</w:t>
+      </w:r>
+    </w:p>
+    <w:p>
+      <w:r>
+        <w:t xml:space="preserve">            Vector&lt;String&gt; ct = </w:t>
+      </w:r>
+      <w:r>
+        <w:rPr>
+          <w:b/>
+          <w:bCs/>
+        </w:rPr>
+        <w:t>new</w:t>
+      </w:r>
+      <w:r>
+        <w:t xml:space="preserve"> Vector&lt;&gt;();</w:t>
+      </w:r>
+    </w:p>
+    <w:p>
+      <w:r>
+        <w:t>            for (String word : ips) {</w:t>
+      </w:r>
+    </w:p>
+    <w:p>
+      <w:r>
+        <w:t>                ct.add(vignereEncrpyt(word, k));</w:t>
+      </w:r>
+    </w:p>
+    <w:p>
+      <w:r>
+        <w:t>            }</w:t>
+      </w:r>
+    </w:p>
+    <w:p>
+      <w:r>
+        <w:t>            String cts = String.join(" ", ct);</w:t>
+      </w:r>
+    </w:p>
+    <w:p>
+      <w:r>
+        <w:t>            System.out.println("The encrypted text is: " + cts);</w:t>
+      </w:r>
+    </w:p>
+    <w:p>
+      <w:r>
+        <w:t>            output.writeUTF(k);</w:t>
+      </w:r>
+    </w:p>
+    <w:p>
+      <w:r>
+        <w:t>            output.writeUTF(cts);</w:t>
+      </w:r>
+    </w:p>
+    <w:p>
+      <w:r>
+        <w:t>            System.out.println(input.readUTF());</w:t>
+      </w:r>
+    </w:p>
+    <w:p>
+      <w:r>
+        <w:t>            input.close();</w:t>
+      </w:r>
+    </w:p>
+    <w:p>
+      <w:r>
+        <w:t>            output.close();</w:t>
+      </w:r>
+    </w:p>
+    <w:p>
+      <w:r>
+        <w:t>            sc.close();</w:t>
+      </w:r>
+    </w:p>
+    <w:p>
+      <w:r>
+        <w:t xml:space="preserve">        } catch (IOException </w:t>
+      </w:r>
+      <w:r>
+        <w:rPr>
+          <w:i/>
+          <w:iCs/>
+        </w:rPr>
+        <w:t>i</w:t>
+      </w:r>
+      <w:r>
+        <w:t>) {</w:t>
+      </w:r>
+    </w:p>
+    <w:p>
+      <w:r>
+        <w:t>            System.out.println(i);</w:t>
+      </w:r>
+    </w:p>
+    <w:p>
+      <w:r>
+        <w:t>        }</w:t>
+      </w:r>
+    </w:p>
+    <w:p>
+      <w:r>
+        <w:t>    }</w:t>
+      </w:r>
+    </w:p>
+    <w:p/>
+    <w:p>
+      <w:r>
+        <w:t xml:space="preserve">    public static </w:t>
+      </w:r>
+      <w:r>
+        <w:rPr>
+          <w:i/>
+          <w:iCs/>
+        </w:rPr>
+        <w:t>void</w:t>
+      </w:r>
+      <w:r>
+        <w:t xml:space="preserve"> main(String[] </w:t>
+      </w:r>
+      <w:r>
+        <w:rPr>
+          <w:i/>
+          <w:iCs/>
+        </w:rPr>
+        <w:t>args</w:t>
+      </w:r>
+      <w:r>
+        <w:t>) {</w:t>
+      </w:r>
+    </w:p>
+    <w:p>
+      <w:r>
+        <w:t xml:space="preserve">        Vignere_Sender vs = </w:t>
+      </w:r>
+      <w:r>
+        <w:rPr>
+          <w:b/>
+          <w:bCs/>
+        </w:rPr>
+        <w:t>new</w:t>
+      </w:r>
+      <w:r>
+        <w:t xml:space="preserve"> Vignere_Sender("127.0.0.1", 5431);</w:t>
+      </w:r>
+    </w:p>
+    <w:p>
+      <w:r>
+        <w:t>        vs.Work();</w:t>
+      </w:r>
+    </w:p>
+    <w:p>
+      <w:r>
+        <w:t>    }</w:t>
+      </w:r>
+    </w:p>
+    <w:p>
+      <w:r>
+        <w:t>}</w:t>
       </w:r>
     </w:p>
     <w:p>
       <w:pPr>
-        <w:rPr>
-          <w:rFonts w:ascii="Times New Roman" w:hAnsi="Times New Roman" w:cs="Times New Roman"/>
-          <w:sz w:val="28"/>
-          <w:szCs w:val="28"/>
-        </w:rPr>
+        <w:pStyle w:val="Heading2"/>
       </w:pPr>
+      <w:r>
+        <w:t>Receiver:</w:t>
+      </w:r>
+    </w:p>
+    <w:p>
+      <w:r>
+        <w:t>import java.util.</w:t>
+      </w:r>
+      <w:r>
+        <w:rPr>
+          <w:i/>
+          <w:iCs/>
+        </w:rPr>
+        <w:t>*</w:t>
+      </w:r>
+      <w:r>
+        <w:t>;</w:t>
+      </w:r>
+    </w:p>
+    <w:p>
+      <w:r>
+        <w:t>import java.io.</w:t>
+      </w:r>
+      <w:r>
+        <w:rPr>
+          <w:i/>
+          <w:iCs/>
+        </w:rPr>
+        <w:t>*</w:t>
+      </w:r>
+      <w:r>
+        <w:t>;</w:t>
+      </w:r>
+    </w:p>
+    <w:p>
+      <w:r>
+        <w:t>import java.net.</w:t>
+      </w:r>
+      <w:r>
+        <w:rPr>
+          <w:i/>
+          <w:iCs/>
+        </w:rPr>
+        <w:t>*</w:t>
+      </w:r>
+      <w:r>
+        <w:t>;</w:t>
+      </w:r>
     </w:p>
     <w:p/>
+    <w:p>
+      <w:r>
+        <w:lastRenderedPageBreak/>
+        <w:t>public class Vignere_Receiver {</w:t>
+      </w:r>
+    </w:p>
+    <w:p>
+      <w:r>
+        <w:t>    private ServerSocket server = null;</w:t>
+      </w:r>
+    </w:p>
+    <w:p>
+      <w:r>
+        <w:t>    private Socket socket = null;</w:t>
+      </w:r>
+    </w:p>
+    <w:p>
+      <w:r>
+        <w:t>    private DataInputStream input = null;</w:t>
+      </w:r>
+    </w:p>
+    <w:p>
+      <w:r>
+        <w:t>    private DataOutputStream output = null;</w:t>
+      </w:r>
+    </w:p>
+    <w:p>
+      <w:r>
+        <w:t xml:space="preserve">    </w:t>
+      </w:r>
+      <w:r>
+        <w:rPr>
+          <w:i/>
+          <w:iCs/>
+        </w:rPr>
+        <w:t>int</w:t>
+      </w:r>
+      <w:r>
+        <w:t xml:space="preserve"> pos = 0;</w:t>
+      </w:r>
+    </w:p>
+    <w:p/>
+    <w:p>
+      <w:r>
+        <w:t>    public Vignere_Receiver(</w:t>
+      </w:r>
+      <w:r>
+        <w:rPr>
+          <w:i/>
+          <w:iCs/>
+        </w:rPr>
+        <w:t>int</w:t>
+      </w:r>
+      <w:r>
+        <w:t xml:space="preserve"> </w:t>
+      </w:r>
+      <w:r>
+        <w:rPr>
+          <w:i/>
+          <w:iCs/>
+        </w:rPr>
+        <w:t>port</w:t>
+      </w:r>
+      <w:r>
+        <w:t>) {</w:t>
+      </w:r>
+    </w:p>
+    <w:p>
+      <w:r>
+        <w:t>        try {</w:t>
+      </w:r>
+    </w:p>
+    <w:p>
+      <w:r>
+        <w:t xml:space="preserve">            server = </w:t>
+      </w:r>
+      <w:r>
+        <w:rPr>
+          <w:b/>
+          <w:bCs/>
+        </w:rPr>
+        <w:t>new</w:t>
+      </w:r>
+      <w:r>
+        <w:t xml:space="preserve"> ServerSocket(</w:t>
+      </w:r>
+      <w:r>
+        <w:rPr>
+          <w:i/>
+          <w:iCs/>
+        </w:rPr>
+        <w:t>port</w:t>
+      </w:r>
+      <w:r>
+        <w:t>);</w:t>
+      </w:r>
+    </w:p>
+    <w:p>
+      <w:r>
+        <w:t>            socket = server.accept();</w:t>
+      </w:r>
+    </w:p>
+    <w:p>
+      <w:r>
+        <w:t>            System.out.println("Client is connected!\n");</w:t>
+      </w:r>
+    </w:p>
+    <w:p>
+      <w:r>
+        <w:t xml:space="preserve">            input = </w:t>
+      </w:r>
+      <w:r>
+        <w:rPr>
+          <w:b/>
+          <w:bCs/>
+        </w:rPr>
+        <w:t>new</w:t>
+      </w:r>
+      <w:r>
+        <w:t xml:space="preserve"> DataInputStream(socket.getInputStream());</w:t>
+      </w:r>
+    </w:p>
+    <w:p>
+      <w:r>
+        <w:t xml:space="preserve">            output = </w:t>
+      </w:r>
+      <w:r>
+        <w:rPr>
+          <w:b/>
+          <w:bCs/>
+        </w:rPr>
+        <w:t>new</w:t>
+      </w:r>
+      <w:r>
+        <w:t xml:space="preserve"> DataOutputStream(socket.getOutputStream());</w:t>
+      </w:r>
+    </w:p>
+    <w:p>
+      <w:r>
+        <w:t xml:space="preserve">        } catch (UnknownHostException </w:t>
+      </w:r>
+      <w:r>
+        <w:rPr>
+          <w:i/>
+          <w:iCs/>
+        </w:rPr>
+        <w:t>u</w:t>
+      </w:r>
+      <w:r>
+        <w:t>) {</w:t>
+      </w:r>
+    </w:p>
+    <w:p>
+      <w:r>
+        <w:t>            System.out.println(u);</w:t>
+      </w:r>
+    </w:p>
+    <w:p>
+      <w:r>
+        <w:t xml:space="preserve">        } catch (IOException </w:t>
+      </w:r>
+      <w:r>
+        <w:rPr>
+          <w:i/>
+          <w:iCs/>
+        </w:rPr>
+        <w:t>i</w:t>
+      </w:r>
+      <w:r>
+        <w:t>) {</w:t>
+      </w:r>
+    </w:p>
+    <w:p>
+      <w:r>
+        <w:t>            System.out.println(i);</w:t>
+      </w:r>
+    </w:p>
+    <w:p>
+      <w:r>
+        <w:t>        }</w:t>
+      </w:r>
+    </w:p>
+    <w:p>
+      <w:r>
+        <w:t>    }</w:t>
+      </w:r>
+    </w:p>
+    <w:p/>
+    <w:p>
+      <w:r>
+        <w:t xml:space="preserve">    String vignereDecrypt(String </w:t>
+      </w:r>
+      <w:r>
+        <w:rPr>
+          <w:i/>
+          <w:iCs/>
+        </w:rPr>
+        <w:t>ct</w:t>
+      </w:r>
+      <w:r>
+        <w:t xml:space="preserve">, String </w:t>
+      </w:r>
+      <w:r>
+        <w:rPr>
+          <w:i/>
+          <w:iCs/>
+        </w:rPr>
+        <w:t>k</w:t>
+      </w:r>
+      <w:r>
+        <w:t>) {</w:t>
+      </w:r>
+    </w:p>
+    <w:p>
+      <w:r>
+        <w:t xml:space="preserve">        StringBuilder pt = </w:t>
+      </w:r>
+      <w:r>
+        <w:rPr>
+          <w:b/>
+          <w:bCs/>
+        </w:rPr>
+        <w:t>new</w:t>
+      </w:r>
+      <w:r>
+        <w:t xml:space="preserve"> StringBuilder();</w:t>
+      </w:r>
+    </w:p>
+    <w:p>
+      <w:r>
+        <w:t xml:space="preserve">        </w:t>
+      </w:r>
+      <w:r>
+        <w:rPr>
+          <w:i/>
+          <w:iCs/>
+        </w:rPr>
+        <w:t>int</w:t>
+      </w:r>
+      <w:r>
+        <w:t xml:space="preserve"> klen = </w:t>
+      </w:r>
+      <w:r>
+        <w:rPr>
+          <w:i/>
+          <w:iCs/>
+        </w:rPr>
+        <w:t>k</w:t>
+      </w:r>
+      <w:r>
+        <w:t>.length();</w:t>
+      </w:r>
+    </w:p>
+    <w:p/>
+    <w:p>
+      <w:r>
+        <w:t>        for (</w:t>
+      </w:r>
+      <w:r>
+        <w:rPr>
+          <w:i/>
+          <w:iCs/>
+        </w:rPr>
+        <w:t>char</w:t>
+      </w:r>
+      <w:r>
+        <w:t xml:space="preserve"> c : </w:t>
+      </w:r>
+      <w:r>
+        <w:rPr>
+          <w:i/>
+          <w:iCs/>
+        </w:rPr>
+        <w:t>ct</w:t>
+      </w:r>
+      <w:r>
+        <w:t>.toCharArray()) {</w:t>
+      </w:r>
+    </w:p>
+    <w:p>
+      <w:r>
+        <w:t xml:space="preserve">            </w:t>
+      </w:r>
+      <w:r>
+        <w:rPr>
+          <w:i/>
+          <w:iCs/>
+        </w:rPr>
+        <w:t>char</w:t>
+      </w:r>
+      <w:r>
+        <w:t xml:space="preserve"> keyChar = </w:t>
+      </w:r>
+      <w:r>
+        <w:rPr>
+          <w:i/>
+          <w:iCs/>
+        </w:rPr>
+        <w:t>k</w:t>
+      </w:r>
+      <w:r>
+        <w:t>.charAt(pos);</w:t>
+      </w:r>
+    </w:p>
+    <w:p>
+      <w:r>
+        <w:t xml:space="preserve">            </w:t>
+      </w:r>
+      <w:r>
+        <w:rPr>
+          <w:i/>
+          <w:iCs/>
+        </w:rPr>
+        <w:t>int</w:t>
+      </w:r>
+      <w:r>
+        <w:t xml:space="preserve"> shift;</w:t>
+      </w:r>
+    </w:p>
+    <w:p>
+      <w:r>
+        <w:t>            if (Character.isUpperCase(keyChar)) {</w:t>
+      </w:r>
+    </w:p>
+    <w:p>
+      <w:r>
+        <w:t>                shift = keyChar - 'A';</w:t>
+      </w:r>
+    </w:p>
+    <w:p>
+      <w:r>
+        <w:t>            } else {</w:t>
+      </w:r>
+    </w:p>
+    <w:p>
+      <w:r>
+        <w:lastRenderedPageBreak/>
+        <w:t>                shift = keyChar - 'a';</w:t>
+      </w:r>
+    </w:p>
+    <w:p>
+      <w:r>
+        <w:t>            }</w:t>
+      </w:r>
+    </w:p>
+    <w:p/>
+    <w:p>
+      <w:r>
+        <w:t>            if (Character.isUpperCase(c)) {</w:t>
+      </w:r>
+    </w:p>
+    <w:p>
+      <w:r>
+        <w:t xml:space="preserve">                </w:t>
+      </w:r>
+      <w:r>
+        <w:rPr>
+          <w:i/>
+          <w:iCs/>
+        </w:rPr>
+        <w:t>int</w:t>
+      </w:r>
+      <w:r>
+        <w:t xml:space="preserve"> ch = (</w:t>
+      </w:r>
+      <w:r>
+        <w:rPr>
+          <w:i/>
+          <w:iCs/>
+        </w:rPr>
+        <w:t>int</w:t>
+      </w:r>
+      <w:r>
+        <w:t>) c - 'A';</w:t>
+      </w:r>
+    </w:p>
+    <w:p>
+      <w:r>
+        <w:t>                ch = (ch - shift) % 26;</w:t>
+      </w:r>
+    </w:p>
+    <w:p>
+      <w:r>
+        <w:t>                if (ch &lt; 0) {</w:t>
+      </w:r>
+    </w:p>
+    <w:p>
+      <w:r>
+        <w:t>                    ch += 26;</w:t>
+      </w:r>
+    </w:p>
+    <w:p>
+      <w:r>
+        <w:t>                }</w:t>
+      </w:r>
+    </w:p>
+    <w:p>
+      <w:r>
+        <w:t xml:space="preserve">                </w:t>
+      </w:r>
+      <w:r>
+        <w:rPr>
+          <w:i/>
+          <w:iCs/>
+        </w:rPr>
+        <w:t>char</w:t>
+      </w:r>
+      <w:r>
+        <w:t xml:space="preserve"> vr = (</w:t>
+      </w:r>
+      <w:r>
+        <w:rPr>
+          <w:i/>
+          <w:iCs/>
+        </w:rPr>
+        <w:t>char</w:t>
+      </w:r>
+      <w:r>
+        <w:t>) (ch + 65);</w:t>
+      </w:r>
+    </w:p>
+    <w:p>
+      <w:r>
+        <w:t>                pt.append(vr);</w:t>
+      </w:r>
+    </w:p>
+    <w:p>
+      <w:r>
+        <w:t>                pos = (pos + 1) % klen;</w:t>
+      </w:r>
+    </w:p>
+    <w:p>
+      <w:r>
+        <w:t>            } else if (Character.isLowerCase(c)) {</w:t>
+      </w:r>
+    </w:p>
+    <w:p>
+      <w:r>
+        <w:t xml:space="preserve">                </w:t>
+      </w:r>
+      <w:r>
+        <w:rPr>
+          <w:i/>
+          <w:iCs/>
+        </w:rPr>
+        <w:t>int</w:t>
+      </w:r>
+      <w:r>
+        <w:t xml:space="preserve"> ch = (</w:t>
+      </w:r>
+      <w:r>
+        <w:rPr>
+          <w:i/>
+          <w:iCs/>
+        </w:rPr>
+        <w:t>int</w:t>
+      </w:r>
+      <w:r>
+        <w:t>) c - 'a';</w:t>
+      </w:r>
+    </w:p>
+    <w:p>
+      <w:r>
+        <w:t>                ch = (ch - shift) % 26;</w:t>
+      </w:r>
+    </w:p>
+    <w:p>
+      <w:r>
+        <w:t>                if (ch &lt; 0) {</w:t>
+      </w:r>
+    </w:p>
+    <w:p>
+      <w:r>
+        <w:t>                    ch += 26;</w:t>
+      </w:r>
+    </w:p>
+    <w:p>
+      <w:r>
+        <w:t>                }</w:t>
+      </w:r>
+    </w:p>
+    <w:p>
+      <w:r>
+        <w:t xml:space="preserve">                </w:t>
+      </w:r>
+      <w:r>
+        <w:rPr>
+          <w:i/>
+          <w:iCs/>
+        </w:rPr>
+        <w:t>char</w:t>
+      </w:r>
+      <w:r>
+        <w:t xml:space="preserve"> vr = (</w:t>
+      </w:r>
+      <w:r>
+        <w:rPr>
+          <w:i/>
+          <w:iCs/>
+        </w:rPr>
+        <w:t>char</w:t>
+      </w:r>
+      <w:r>
+        <w:t>) (ch + 97);</w:t>
+      </w:r>
+    </w:p>
+    <w:p>
+      <w:r>
+        <w:t>                pt.append(vr);</w:t>
+      </w:r>
+    </w:p>
+    <w:p>
+      <w:r>
+        <w:t>                pos = (pos + 1) % klen;</w:t>
+      </w:r>
+    </w:p>
+    <w:p>
+      <w:r>
+        <w:t>            } else {</w:t>
+      </w:r>
+    </w:p>
+    <w:p>
+      <w:r>
+        <w:t>                pt.append(c);</w:t>
+      </w:r>
+    </w:p>
+    <w:p>
+      <w:r>
+        <w:t>            }</w:t>
+      </w:r>
+    </w:p>
+    <w:p>
+      <w:r>
+        <w:t>        }</w:t>
+      </w:r>
+    </w:p>
+    <w:p/>
+    <w:p>
+      <w:r>
+        <w:t>        return pt.toString();</w:t>
+      </w:r>
+    </w:p>
+    <w:p>
+      <w:r>
+        <w:t>    }</w:t>
+      </w:r>
+    </w:p>
+    <w:p/>
+    <w:p>
+      <w:r>
+        <w:t xml:space="preserve">    public </w:t>
+      </w:r>
+      <w:r>
+        <w:rPr>
+          <w:i/>
+          <w:iCs/>
+        </w:rPr>
+        <w:t>void</w:t>
+      </w:r>
+      <w:r>
+        <w:t xml:space="preserve"> Work() {</w:t>
+      </w:r>
+    </w:p>
+    <w:p>
+      <w:r>
+        <w:t>        try {</w:t>
+      </w:r>
+    </w:p>
+    <w:p>
+      <w:r>
+        <w:lastRenderedPageBreak/>
+        <w:t>            String k = input.readUTF();</w:t>
+      </w:r>
+    </w:p>
+    <w:p>
+      <w:r>
+        <w:t>            String ip = input.readUTF();</w:t>
+      </w:r>
+    </w:p>
+    <w:p>
+      <w:r>
+        <w:t>            String[] ips = ip.trim().split("\\s+");</w:t>
+      </w:r>
+    </w:p>
+    <w:p>
+      <w:r>
+        <w:t xml:space="preserve">            Vector&lt;String&gt; ct = </w:t>
+      </w:r>
+      <w:r>
+        <w:rPr>
+          <w:b/>
+          <w:bCs/>
+        </w:rPr>
+        <w:t>new</w:t>
+      </w:r>
+      <w:r>
+        <w:t xml:space="preserve"> Vector&lt;&gt;();</w:t>
+      </w:r>
+    </w:p>
+    <w:p>
+      <w:r>
+        <w:t>            for (String word : ips) {</w:t>
+      </w:r>
+    </w:p>
+    <w:p>
+      <w:r>
+        <w:t>                ct.add(vignereDecrypt(word, k));</w:t>
+      </w:r>
+    </w:p>
+    <w:p>
+      <w:r>
+        <w:t>            }</w:t>
+      </w:r>
+    </w:p>
+    <w:p>
+      <w:r>
+        <w:t>            System.out.println("The received encrypted text is: " + ip);</w:t>
+      </w:r>
+    </w:p>
+    <w:p>
+      <w:r>
+        <w:t>            System.out.println("The received key is: " + k);</w:t>
+      </w:r>
+    </w:p>
+    <w:p>
+      <w:r>
+        <w:t>            String cts = String.join(" ", ct);</w:t>
+      </w:r>
+    </w:p>
+    <w:p>
+      <w:r>
+        <w:t>            System.out.println("The decrypted text is: " + cts);</w:t>
+      </w:r>
+    </w:p>
+    <w:p>
+      <w:r>
+        <w:t>            output.writeUTF("Success from receiver!");</w:t>
+      </w:r>
+    </w:p>
+    <w:p>
+      <w:r>
+        <w:t>            input.close();</w:t>
+      </w:r>
+    </w:p>
+    <w:p>
+      <w:r>
+        <w:t>            output.close();</w:t>
+      </w:r>
+    </w:p>
+    <w:p>
+      <w:r>
+        <w:t xml:space="preserve">        } catch (IOException </w:t>
+      </w:r>
+      <w:r>
+        <w:rPr>
+          <w:i/>
+          <w:iCs/>
+        </w:rPr>
+        <w:t>i</w:t>
+      </w:r>
+      <w:r>
+        <w:t>) {</w:t>
+      </w:r>
+    </w:p>
+    <w:p>
+      <w:r>
+        <w:t>            System.out.println(i);</w:t>
+      </w:r>
+    </w:p>
+    <w:p>
+      <w:r>
+        <w:t>        }</w:t>
+      </w:r>
+    </w:p>
+    <w:p>
+      <w:r>
+        <w:t>    }</w:t>
+      </w:r>
+    </w:p>
+    <w:p/>
+    <w:p>
+      <w:r>
+        <w:t xml:space="preserve">    public static </w:t>
+      </w:r>
+      <w:r>
+        <w:rPr>
+          <w:i/>
+          <w:iCs/>
+        </w:rPr>
+        <w:t>void</w:t>
+      </w:r>
+      <w:r>
+        <w:t xml:space="preserve"> main(String[] </w:t>
+      </w:r>
+      <w:r>
+        <w:rPr>
+          <w:i/>
+          <w:iCs/>
+        </w:rPr>
+        <w:t>args</w:t>
+      </w:r>
+      <w:r>
+        <w:t>) {</w:t>
+      </w:r>
+    </w:p>
+    <w:p>
+      <w:r>
+        <w:t xml:space="preserve">        Vignere_Receiver vr = </w:t>
+      </w:r>
+      <w:r>
+        <w:rPr>
+          <w:b/>
+          <w:bCs/>
+        </w:rPr>
+        <w:t>new</w:t>
+      </w:r>
+      <w:r>
+        <w:t xml:space="preserve"> Vignere_Receiver(5431);</w:t>
+      </w:r>
+    </w:p>
+    <w:p>
+      <w:r>
+        <w:t>        vr.Work();</w:t>
+      </w:r>
+    </w:p>
+    <w:p>
+      <w:r>
+        <w:t>    }</w:t>
+      </w:r>
+    </w:p>
+    <w:p>
+      <w:r>
+        <w:t>}</w:t>
+      </w:r>
+    </w:p>
+    <w:p>
+      <w:pPr>
+        <w:pStyle w:val="Heading1"/>
+      </w:pPr>
+      <w:r>
+        <w:lastRenderedPageBreak/>
+        <w:t>Output (Vigenère Cipher):</w:t>
+      </w:r>
+    </w:p>
+    <w:p>
+      <w:pPr>
+        <w:pStyle w:val="Heading2"/>
+      </w:pPr>
+      <w:r>
+        <w:t>Sender:</w:t>
+      </w:r>
+    </w:p>
+    <w:p>
+      <w:r>
+        <w:drawing>
+          <wp:inline distT="0" distB="0" distL="0" distR="0" wp14:anchorId="353B6D55" wp14:editId="1D9CC1F6">
+            <wp:extent cx="5731510" cy="2945130"/>
+            <wp:effectExtent l="0" t="0" r="2540" b="7620"/>
+            <wp:docPr id="212556760" name="Picture 1" descr="A screenshot of a computer&#10;&#10;AI-generated content may be incorrect."/>
+            <wp:cNvGraphicFramePr>
+              <a:graphicFrameLocks xmlns:a="http://schemas.openxmlformats.org/drawingml/2006/main" noChangeAspect="1"/>
+            </wp:cNvGraphicFramePr>
+            <a:graphic xmlns:a="http://schemas.openxmlformats.org/drawingml/2006/main">
+              <a:graphicData uri="http://schemas.openxmlformats.org/drawingml/2006/picture">
+                <pic:pic xmlns:pic="http://schemas.openxmlformats.org/drawingml/2006/picture">
+                  <pic:nvPicPr>
+                    <pic:cNvPr id="212556760" name="Picture 1" descr="A screenshot of a computer&#10;&#10;AI-generated content may be incorrect."/>
+                    <pic:cNvPicPr/>
+                  </pic:nvPicPr>
+                  <pic:blipFill>
+                    <a:blip r:embed="rId9"/>
+                    <a:stretch>
+                      <a:fillRect/>
+                    </a:stretch>
+                  </pic:blipFill>
+                  <pic:spPr>
+                    <a:xfrm>
+                      <a:off x="0" y="0"/>
+                      <a:ext cx="5731510" cy="2945130"/>
+                    </a:xfrm>
+                    <a:prstGeom prst="rect">
+                      <a:avLst/>
+                    </a:prstGeom>
+                  </pic:spPr>
+                </pic:pic>
+              </a:graphicData>
+            </a:graphic>
+          </wp:inline>
+        </w:drawing>
+      </w:r>
+    </w:p>
+    <w:p>
+      <w:pPr>
+        <w:pStyle w:val="Heading2"/>
+      </w:pPr>
+      <w:r>
+        <w:t>Receiver:</w:t>
+      </w:r>
+    </w:p>
+    <w:p>
+      <w:r>
+        <w:drawing>
+          <wp:inline distT="0" distB="0" distL="0" distR="0" wp14:anchorId="64C8A3CD" wp14:editId="26DA0C6C">
+            <wp:extent cx="5731510" cy="2945130"/>
+            <wp:effectExtent l="0" t="0" r="2540" b="7620"/>
+            <wp:docPr id="1886874803" name="Picture 1" descr="A screenshot of a computer&#10;&#10;AI-generated content may be incorrect."/>
+            <wp:cNvGraphicFramePr>
+              <a:graphicFrameLocks xmlns:a="http://schemas.openxmlformats.org/drawingml/2006/main" noChangeAspect="1"/>
+            </wp:cNvGraphicFramePr>
+            <a:graphic xmlns:a="http://schemas.openxmlformats.org/drawingml/2006/main">
+              <a:graphicData uri="http://schemas.openxmlformats.org/drawingml/2006/picture">
+                <pic:pic xmlns:pic="http://schemas.openxmlformats.org/drawingml/2006/picture">
+                  <pic:nvPicPr>
+                    <pic:cNvPr id="1886874803" name="Picture 1" descr="A screenshot of a computer&#10;&#10;AI-generated content may be incorrect."/>
+                    <pic:cNvPicPr/>
+                  </pic:nvPicPr>
+                  <pic:blipFill>
+                    <a:blip r:embed="rId10"/>
+                    <a:stretch>
+                      <a:fillRect/>
+                    </a:stretch>
+                  </pic:blipFill>
+                  <pic:spPr>
+                    <a:xfrm>
+                      <a:off x="0" y="0"/>
+                      <a:ext cx="5731510" cy="2945130"/>
+                    </a:xfrm>
+                    <a:prstGeom prst="rect">
+                      <a:avLst/>
+                    </a:prstGeom>
+                  </pic:spPr>
+                </pic:pic>
+              </a:graphicData>
+            </a:graphic>
+          </wp:inline>
+        </w:drawing>
+      </w:r>
+    </w:p>
+    <w:p>
+      <w:pPr>
+        <w:spacing w:line="259" w:lineRule="auto"/>
+      </w:pPr>
+      <w:r>
+        <w:br w:type="page"/>
+      </w:r>
+    </w:p>
+    <w:p>
+      <w:pPr>
+        <w:pStyle w:val="Heading1"/>
+      </w:pPr>
+      <w:r>
+        <w:lastRenderedPageBreak/>
+        <w:t>Code (Vernam Cipher):</w:t>
+      </w:r>
+    </w:p>
+    <w:p>
+      <w:pPr>
+        <w:pStyle w:val="Heading2"/>
+      </w:pPr>
+      <w:r>
+        <w:t>Sender:</w:t>
+      </w:r>
+    </w:p>
+    <w:p>
+      <w:r>
+        <w:t>import java.util.</w:t>
+      </w:r>
+      <w:r>
+        <w:rPr>
+          <w:i/>
+          <w:iCs/>
+        </w:rPr>
+        <w:t>*</w:t>
+      </w:r>
+      <w:r>
+        <w:t>;</w:t>
+      </w:r>
+    </w:p>
+    <w:p>
+      <w:r>
+        <w:t>import java.io.</w:t>
+      </w:r>
+      <w:r>
+        <w:rPr>
+          <w:i/>
+          <w:iCs/>
+        </w:rPr>
+        <w:t>*</w:t>
+      </w:r>
+      <w:r>
+        <w:t>;</w:t>
+      </w:r>
+    </w:p>
+    <w:p>
+      <w:r>
+        <w:t>import java.net.</w:t>
+      </w:r>
+      <w:r>
+        <w:rPr>
+          <w:i/>
+          <w:iCs/>
+        </w:rPr>
+        <w:t>*</w:t>
+      </w:r>
+      <w:r>
+        <w:t>;</w:t>
+      </w:r>
+    </w:p>
+    <w:p/>
+    <w:p>
+      <w:r>
+        <w:t>public class Vernam_Sender {</w:t>
+      </w:r>
+    </w:p>
+    <w:p>
+      <w:r>
+        <w:t>    private Socket socket = null;</w:t>
+      </w:r>
+    </w:p>
+    <w:p>
+      <w:r>
+        <w:t>    private DataInputStream input = null;</w:t>
+      </w:r>
+    </w:p>
+    <w:p>
+      <w:r>
+        <w:t>    private DataOutputStream output = null;</w:t>
+      </w:r>
+    </w:p>
+    <w:p>
+      <w:r>
+        <w:t>    private Scanner sc = null;</w:t>
+      </w:r>
+    </w:p>
+    <w:p>
+      <w:r>
+        <w:t xml:space="preserve">    </w:t>
+      </w:r>
+      <w:r>
+        <w:rPr>
+          <w:i/>
+          <w:iCs/>
+        </w:rPr>
+        <w:t>int</w:t>
+      </w:r>
+      <w:r>
+        <w:t xml:space="preserve"> pos = 0;</w:t>
+      </w:r>
+    </w:p>
+    <w:p/>
+    <w:p>
+      <w:r>
+        <w:t xml:space="preserve">    public Vernam_Sender(String </w:t>
+      </w:r>
+      <w:r>
+        <w:rPr>
+          <w:i/>
+          <w:iCs/>
+        </w:rPr>
+        <w:t>address</w:t>
+      </w:r>
+      <w:r>
+        <w:t xml:space="preserve">, </w:t>
+      </w:r>
+      <w:r>
+        <w:rPr>
+          <w:i/>
+          <w:iCs/>
+        </w:rPr>
+        <w:t>int</w:t>
+      </w:r>
+      <w:r>
+        <w:t xml:space="preserve"> </w:t>
+      </w:r>
+      <w:r>
+        <w:rPr>
+          <w:i/>
+          <w:iCs/>
+        </w:rPr>
+        <w:t>port</w:t>
+      </w:r>
+      <w:r>
+        <w:t>) {</w:t>
+      </w:r>
+    </w:p>
+    <w:p>
+      <w:r>
+        <w:t>        try {</w:t>
+      </w:r>
+    </w:p>
+    <w:p>
+      <w:r>
+        <w:t xml:space="preserve">            socket = </w:t>
+      </w:r>
+      <w:r>
+        <w:rPr>
+          <w:b/>
+          <w:bCs/>
+        </w:rPr>
+        <w:t>new</w:t>
+      </w:r>
+      <w:r>
+        <w:t xml:space="preserve"> Socket(</w:t>
+      </w:r>
+      <w:r>
+        <w:rPr>
+          <w:i/>
+          <w:iCs/>
+        </w:rPr>
+        <w:t>address</w:t>
+      </w:r>
+      <w:r>
+        <w:t xml:space="preserve">, </w:t>
+      </w:r>
+      <w:r>
+        <w:rPr>
+          <w:i/>
+          <w:iCs/>
+        </w:rPr>
+        <w:t>port</w:t>
+      </w:r>
+      <w:r>
+        <w:t>);</w:t>
+      </w:r>
+    </w:p>
+    <w:p>
+      <w:r>
+        <w:t>            System.out.println("Client is connected!");</w:t>
+      </w:r>
+    </w:p>
+    <w:p>
+      <w:r>
+        <w:t xml:space="preserve">            input = </w:t>
+      </w:r>
+      <w:r>
+        <w:rPr>
+          <w:b/>
+          <w:bCs/>
+        </w:rPr>
+        <w:t>new</w:t>
+      </w:r>
+      <w:r>
+        <w:t xml:space="preserve"> DataInputStream(socket.getInputStream());</w:t>
+      </w:r>
+    </w:p>
+    <w:p>
+      <w:r>
+        <w:t xml:space="preserve">            output = </w:t>
+      </w:r>
+      <w:r>
+        <w:rPr>
+          <w:b/>
+          <w:bCs/>
+        </w:rPr>
+        <w:t>new</w:t>
+      </w:r>
+      <w:r>
+        <w:t xml:space="preserve"> DataOutputStream(socket.getOutputStream());</w:t>
+      </w:r>
+    </w:p>
+    <w:p>
+      <w:r>
+        <w:t xml:space="preserve">            sc = </w:t>
+      </w:r>
+      <w:r>
+        <w:rPr>
+          <w:b/>
+          <w:bCs/>
+        </w:rPr>
+        <w:t>new</w:t>
+      </w:r>
+      <w:r>
+        <w:t xml:space="preserve"> Scanner(System.in);</w:t>
+      </w:r>
+    </w:p>
+    <w:p>
+      <w:r>
+        <w:t xml:space="preserve">        } catch (UnknownHostException </w:t>
+      </w:r>
+      <w:r>
+        <w:rPr>
+          <w:i/>
+          <w:iCs/>
+        </w:rPr>
+        <w:t>u</w:t>
+      </w:r>
+      <w:r>
+        <w:t>) {</w:t>
+      </w:r>
+    </w:p>
+    <w:p>
+      <w:r>
+        <w:t>            System.out.println(u);</w:t>
+      </w:r>
+    </w:p>
+    <w:p>
+      <w:r>
+        <w:t xml:space="preserve">        } catch (IOException </w:t>
+      </w:r>
+      <w:r>
+        <w:rPr>
+          <w:i/>
+          <w:iCs/>
+        </w:rPr>
+        <w:t>i</w:t>
+      </w:r>
+      <w:r>
+        <w:t>) {</w:t>
+      </w:r>
+    </w:p>
+    <w:p>
+      <w:r>
+        <w:t>            System.out.println(i);</w:t>
+      </w:r>
+    </w:p>
+    <w:p>
+      <w:r>
+        <w:t>        }</w:t>
+      </w:r>
+    </w:p>
+    <w:p>
+      <w:r>
+        <w:t>    }</w:t>
+      </w:r>
+    </w:p>
+    <w:p/>
+    <w:p>
+      <w:r>
+        <w:t xml:space="preserve">    String vernamEncrypt(String </w:t>
+      </w:r>
+      <w:r>
+        <w:rPr>
+          <w:i/>
+          <w:iCs/>
+        </w:rPr>
+        <w:t>pt</w:t>
+      </w:r>
+      <w:r>
+        <w:t xml:space="preserve">, String </w:t>
+      </w:r>
+      <w:r>
+        <w:rPr>
+          <w:i/>
+          <w:iCs/>
+        </w:rPr>
+        <w:t>k</w:t>
+      </w:r>
+      <w:r>
+        <w:t>) {</w:t>
+      </w:r>
+    </w:p>
+    <w:p>
+      <w:r>
+        <w:t xml:space="preserve">        StringBuilder ct = </w:t>
+      </w:r>
+      <w:r>
+        <w:rPr>
+          <w:b/>
+          <w:bCs/>
+        </w:rPr>
+        <w:t>new</w:t>
+      </w:r>
+      <w:r>
+        <w:t xml:space="preserve"> StringBuilder();</w:t>
+      </w:r>
+    </w:p>
+    <w:p>
+      <w:r>
+        <w:t>        for (</w:t>
+      </w:r>
+      <w:r>
+        <w:rPr>
+          <w:i/>
+          <w:iCs/>
+        </w:rPr>
+        <w:t>int</w:t>
+      </w:r>
+      <w:r>
+        <w:t xml:space="preserve"> i = 0; i &lt; </w:t>
+      </w:r>
+      <w:r>
+        <w:rPr>
+          <w:i/>
+          <w:iCs/>
+        </w:rPr>
+        <w:t>pt</w:t>
+      </w:r>
+      <w:r>
+        <w:t>.length(); i++) {</w:t>
+      </w:r>
+    </w:p>
+    <w:p>
+      <w:r>
+        <w:t xml:space="preserve">            </w:t>
+      </w:r>
+      <w:r>
+        <w:rPr>
+          <w:i/>
+          <w:iCs/>
+        </w:rPr>
+        <w:t>char</w:t>
+      </w:r>
+      <w:r>
+        <w:t xml:space="preserve"> pChar = </w:t>
+      </w:r>
+      <w:r>
+        <w:rPr>
+          <w:i/>
+          <w:iCs/>
+        </w:rPr>
+        <w:t>pt</w:t>
+      </w:r>
+      <w:r>
+        <w:t>.charAt(i);</w:t>
+      </w:r>
+    </w:p>
+    <w:p>
+      <w:r>
+        <w:lastRenderedPageBreak/>
+        <w:t xml:space="preserve">            </w:t>
+      </w:r>
+      <w:r>
+        <w:rPr>
+          <w:i/>
+          <w:iCs/>
+        </w:rPr>
+        <w:t>char</w:t>
+      </w:r>
+      <w:r>
+        <w:t xml:space="preserve"> kChar = </w:t>
+      </w:r>
+      <w:r>
+        <w:rPr>
+          <w:i/>
+          <w:iCs/>
+        </w:rPr>
+        <w:t>k</w:t>
+      </w:r>
+      <w:r>
+        <w:t>.charAt(i);</w:t>
+      </w:r>
+    </w:p>
+    <w:p>
+      <w:r>
+        <w:t xml:space="preserve">            </w:t>
+      </w:r>
+      <w:r>
+        <w:rPr>
+          <w:i/>
+          <w:iCs/>
+        </w:rPr>
+        <w:t>int</w:t>
+      </w:r>
+      <w:r>
+        <w:t xml:space="preserve"> pc, kc;</w:t>
+      </w:r>
+    </w:p>
+    <w:p>
+      <w:r>
+        <w:t>            if (Character.isUpperCase(pChar)) {</w:t>
+      </w:r>
+    </w:p>
+    <w:p>
+      <w:r>
+        <w:t>                pc = (</w:t>
+      </w:r>
+      <w:r>
+        <w:rPr>
+          <w:i/>
+          <w:iCs/>
+        </w:rPr>
+        <w:t>int</w:t>
+      </w:r>
+      <w:r>
+        <w:t>) pChar - 'A';</w:t>
+      </w:r>
+    </w:p>
+    <w:p>
+      <w:r>
+        <w:t>            } else {</w:t>
+      </w:r>
+    </w:p>
+    <w:p>
+      <w:r>
+        <w:t>                pc = (</w:t>
+      </w:r>
+      <w:r>
+        <w:rPr>
+          <w:i/>
+          <w:iCs/>
+        </w:rPr>
+        <w:t>int</w:t>
+      </w:r>
+      <w:r>
+        <w:t>) pChar - 'a';</w:t>
+      </w:r>
+    </w:p>
+    <w:p>
+      <w:r>
+        <w:t>            }</w:t>
+      </w:r>
+    </w:p>
+    <w:p>
+      <w:r>
+        <w:t>            if (Character.isUpperCase(kChar)) {</w:t>
+      </w:r>
+    </w:p>
+    <w:p>
+      <w:r>
+        <w:t>                kc = (</w:t>
+      </w:r>
+      <w:r>
+        <w:rPr>
+          <w:i/>
+          <w:iCs/>
+        </w:rPr>
+        <w:t>int</w:t>
+      </w:r>
+      <w:r>
+        <w:t>) kChar - 'A';</w:t>
+      </w:r>
+    </w:p>
+    <w:p>
+      <w:r>
+        <w:t>            } else {</w:t>
+      </w:r>
+    </w:p>
+    <w:p>
+      <w:r>
+        <w:t>                kc = (</w:t>
+      </w:r>
+      <w:r>
+        <w:rPr>
+          <w:i/>
+          <w:iCs/>
+        </w:rPr>
+        <w:t>int</w:t>
+      </w:r>
+      <w:r>
+        <w:t>) kChar - 'a';</w:t>
+      </w:r>
+    </w:p>
+    <w:p>
+      <w:r>
+        <w:t>            }</w:t>
+      </w:r>
+    </w:p>
+    <w:p>
+      <w:r>
+        <w:t xml:space="preserve">            </w:t>
+      </w:r>
+      <w:r>
+        <w:rPr>
+          <w:i/>
+          <w:iCs/>
+        </w:rPr>
+        <w:t>int</w:t>
+      </w:r>
+      <w:r>
+        <w:t xml:space="preserve"> cc = (pc ^ kc);</w:t>
+      </w:r>
+    </w:p>
+    <w:p>
+      <w:r>
+        <w:t>            if (Character.isUpperCase(pChar)) {</w:t>
+      </w:r>
+    </w:p>
+    <w:p>
+      <w:r>
+        <w:t xml:space="preserve">                </w:t>
+      </w:r>
+      <w:r>
+        <w:rPr>
+          <w:i/>
+          <w:iCs/>
+        </w:rPr>
+        <w:t>char</w:t>
+      </w:r>
+      <w:r>
+        <w:t xml:space="preserve"> cChar = (</w:t>
+      </w:r>
+      <w:r>
+        <w:rPr>
+          <w:i/>
+          <w:iCs/>
+        </w:rPr>
+        <w:t>char</w:t>
+      </w:r>
+      <w:r>
+        <w:t>) (cc + 'A');</w:t>
+      </w:r>
+    </w:p>
+    <w:p>
+      <w:r>
+        <w:t>                ct.append(cChar);</w:t>
+      </w:r>
+    </w:p>
+    <w:p>
+      <w:r>
+        <w:t>            } else {</w:t>
+      </w:r>
+    </w:p>
+    <w:p>
+      <w:r>
+        <w:t xml:space="preserve">                </w:t>
+      </w:r>
+      <w:r>
+        <w:rPr>
+          <w:i/>
+          <w:iCs/>
+        </w:rPr>
+        <w:t>char</w:t>
+      </w:r>
+      <w:r>
+        <w:t xml:space="preserve"> cChar = (</w:t>
+      </w:r>
+      <w:r>
+        <w:rPr>
+          <w:i/>
+          <w:iCs/>
+        </w:rPr>
+        <w:t>char</w:t>
+      </w:r>
+      <w:r>
+        <w:t>) (cc + 'a');</w:t>
+      </w:r>
+    </w:p>
+    <w:p>
+      <w:r>
+        <w:t>                ct.append(cChar);</w:t>
+      </w:r>
+    </w:p>
+    <w:p>
+      <w:r>
+        <w:t>            }</w:t>
+      </w:r>
+    </w:p>
+    <w:p>
+      <w:r>
+        <w:t>        }</w:t>
+      </w:r>
+    </w:p>
+    <w:p>
+      <w:r>
+        <w:t>        return ct.toString();</w:t>
+      </w:r>
+    </w:p>
+    <w:p>
+      <w:r>
+        <w:t>    }</w:t>
+      </w:r>
+    </w:p>
+    <w:p/>
+    <w:p>
+      <w:r>
+        <w:t xml:space="preserve">    public </w:t>
+      </w:r>
+      <w:r>
+        <w:rPr>
+          <w:i/>
+          <w:iCs/>
+        </w:rPr>
+        <w:t>void</w:t>
+      </w:r>
+      <w:r>
+        <w:t xml:space="preserve"> Work() {</w:t>
+      </w:r>
+    </w:p>
+    <w:p>
+      <w:r>
+        <w:t>        try {</w:t>
+      </w:r>
+    </w:p>
+    <w:p>
+      <w:r>
+        <w:t>            System.out.print("Enter the message: ");</w:t>
+      </w:r>
+    </w:p>
+    <w:p>
+      <w:r>
+        <w:t>            String ips = sc.next().trim();</w:t>
+      </w:r>
+    </w:p>
+    <w:p>
+      <w:r>
+        <w:t>            System.out.print("Enter the key: ");</w:t>
+      </w:r>
+    </w:p>
+    <w:p>
+      <w:r>
+        <w:t>            String k = sc.next().trim();</w:t>
+      </w:r>
+    </w:p>
+    <w:p>
+      <w:r>
+        <w:t>            String cts = vernamEncrypt(ips, k);</w:t>
+      </w:r>
+    </w:p>
+    <w:p>
+      <w:r>
+        <w:lastRenderedPageBreak/>
+        <w:t>            System.out.println("The encrypted text is: " + cts);</w:t>
+      </w:r>
+    </w:p>
+    <w:p>
+      <w:r>
+        <w:t>            output.writeUTF(k);</w:t>
+      </w:r>
+    </w:p>
+    <w:p>
+      <w:r>
+        <w:t>            output.writeUTF(cts);</w:t>
+      </w:r>
+    </w:p>
+    <w:p>
+      <w:r>
+        <w:t>            System.out.println(input.readUTF());</w:t>
+      </w:r>
+    </w:p>
+    <w:p>
+      <w:r>
+        <w:t>            input.close();</w:t>
+      </w:r>
+    </w:p>
+    <w:p>
+      <w:r>
+        <w:t>            output.close();</w:t>
+      </w:r>
+    </w:p>
+    <w:p>
+      <w:r>
+        <w:t>            sc.close();</w:t>
+      </w:r>
+    </w:p>
+    <w:p>
+      <w:r>
+        <w:t xml:space="preserve">        } catch (IOException </w:t>
+      </w:r>
+      <w:r>
+        <w:rPr>
+          <w:i/>
+          <w:iCs/>
+        </w:rPr>
+        <w:t>i</w:t>
+      </w:r>
+      <w:r>
+        <w:t>) {</w:t>
+      </w:r>
+    </w:p>
+    <w:p>
+      <w:r>
+        <w:t>            System.out.println(i);</w:t>
+      </w:r>
+    </w:p>
+    <w:p>
+      <w:r>
+        <w:t>        }</w:t>
+      </w:r>
+    </w:p>
+    <w:p>
+      <w:r>
+        <w:t>    }</w:t>
+      </w:r>
+    </w:p>
+    <w:p/>
+    <w:p>
+      <w:r>
+        <w:t xml:space="preserve">    public static </w:t>
+      </w:r>
+      <w:r>
+        <w:rPr>
+          <w:i/>
+          <w:iCs/>
+        </w:rPr>
+        <w:t>void</w:t>
+      </w:r>
+      <w:r>
+        <w:t xml:space="preserve"> main(String[] </w:t>
+      </w:r>
+      <w:r>
+        <w:rPr>
+          <w:i/>
+          <w:iCs/>
+        </w:rPr>
+        <w:t>args</w:t>
+      </w:r>
+      <w:r>
+        <w:t>) {</w:t>
+      </w:r>
+    </w:p>
+    <w:p>
+      <w:r>
+        <w:t xml:space="preserve">        Vernam_Sender vs = </w:t>
+      </w:r>
+      <w:r>
+        <w:rPr>
+          <w:b/>
+          <w:bCs/>
+        </w:rPr>
+        <w:t>new</w:t>
+      </w:r>
+      <w:r>
+        <w:t xml:space="preserve"> Vernam_Sender("127.0.0.1", 5431);</w:t>
+      </w:r>
+    </w:p>
+    <w:p>
+      <w:r>
+        <w:t>        vs.Work();</w:t>
+      </w:r>
+    </w:p>
+    <w:p>
+      <w:r>
+        <w:t>    }</w:t>
+      </w:r>
+    </w:p>
+    <w:p>
+      <w:r>
+        <w:t>}</w:t>
+      </w:r>
+    </w:p>
+    <w:p>
+      <w:pPr>
+        <w:pStyle w:val="Heading2"/>
+      </w:pPr>
+      <w:r>
+        <w:t>Receiver:</w:t>
+      </w:r>
+    </w:p>
+    <w:p>
+      <w:r>
+        <w:t>import java.io.</w:t>
+      </w:r>
+      <w:r>
+        <w:rPr>
+          <w:i/>
+          <w:iCs/>
+        </w:rPr>
+        <w:t>*</w:t>
+      </w:r>
+      <w:r>
+        <w:t>;</w:t>
+      </w:r>
+    </w:p>
+    <w:p>
+      <w:r>
+        <w:t>import java.net.</w:t>
+      </w:r>
+      <w:r>
+        <w:rPr>
+          <w:i/>
+          <w:iCs/>
+        </w:rPr>
+        <w:t>*</w:t>
+      </w:r>
+      <w:r>
+        <w:t>;</w:t>
+      </w:r>
+    </w:p>
+    <w:p/>
+    <w:p>
+      <w:r>
+        <w:t>public class Vernam_Receiver {</w:t>
+      </w:r>
+    </w:p>
+    <w:p>
+      <w:r>
+        <w:t>    private ServerSocket server = null;</w:t>
+      </w:r>
+    </w:p>
+    <w:p>
+      <w:r>
+        <w:t>    private Socket socket = null;</w:t>
+      </w:r>
+    </w:p>
+    <w:p>
+      <w:r>
+        <w:t>    private DataInputStream input = null;</w:t>
+      </w:r>
+    </w:p>
+    <w:p>
+      <w:r>
+        <w:t>    private DataOutputStream output = null;</w:t>
+      </w:r>
+    </w:p>
+    <w:p>
+      <w:r>
+        <w:t xml:space="preserve">    </w:t>
+      </w:r>
+      <w:r>
+        <w:rPr>
+          <w:i/>
+          <w:iCs/>
+        </w:rPr>
+        <w:t>int</w:t>
+      </w:r>
+      <w:r>
+        <w:t xml:space="preserve"> pos = 0;</w:t>
+      </w:r>
+    </w:p>
+    <w:p/>
+    <w:p>
+      <w:r>
+        <w:t>    public Vernam_Receiver(</w:t>
+      </w:r>
+      <w:r>
+        <w:rPr>
+          <w:i/>
+          <w:iCs/>
+        </w:rPr>
+        <w:t>int</w:t>
+      </w:r>
+      <w:r>
+        <w:t xml:space="preserve"> </w:t>
+      </w:r>
+      <w:r>
+        <w:rPr>
+          <w:i/>
+          <w:iCs/>
+        </w:rPr>
+        <w:t>port</w:t>
+      </w:r>
+      <w:r>
+        <w:t>) {</w:t>
+      </w:r>
+    </w:p>
+    <w:p>
+      <w:r>
+        <w:t>        try {</w:t>
+      </w:r>
+    </w:p>
+    <w:p>
+      <w:r>
+        <w:t xml:space="preserve">            server = </w:t>
+      </w:r>
+      <w:r>
+        <w:rPr>
+          <w:b/>
+          <w:bCs/>
+        </w:rPr>
+        <w:t>new</w:t>
+      </w:r>
+      <w:r>
+        <w:t xml:space="preserve"> ServerSocket(</w:t>
+      </w:r>
+      <w:r>
+        <w:rPr>
+          <w:i/>
+          <w:iCs/>
+        </w:rPr>
+        <w:t>port</w:t>
+      </w:r>
+      <w:r>
+        <w:t>);</w:t>
+      </w:r>
+    </w:p>
+    <w:p>
+      <w:r>
+        <w:lastRenderedPageBreak/>
+        <w:t>            socket = server.accept();</w:t>
+      </w:r>
+    </w:p>
+    <w:p>
+      <w:r>
+        <w:t>            System.out.println("Client is connected!\n");</w:t>
+      </w:r>
+    </w:p>
+    <w:p>
+      <w:r>
+        <w:t xml:space="preserve">            input = </w:t>
+      </w:r>
+      <w:r>
+        <w:rPr>
+          <w:b/>
+          <w:bCs/>
+        </w:rPr>
+        <w:t>new</w:t>
+      </w:r>
+      <w:r>
+        <w:t xml:space="preserve"> DataInputStream(socket.getInputStream());</w:t>
+      </w:r>
+    </w:p>
+    <w:p>
+      <w:r>
+        <w:t xml:space="preserve">            output = </w:t>
+      </w:r>
+      <w:r>
+        <w:rPr>
+          <w:b/>
+          <w:bCs/>
+        </w:rPr>
+        <w:t>new</w:t>
+      </w:r>
+      <w:r>
+        <w:t xml:space="preserve"> DataOutputStream(socket.getOutputStream());</w:t>
+      </w:r>
+    </w:p>
+    <w:p>
+      <w:r>
+        <w:t xml:space="preserve">        } catch (UnknownHostException </w:t>
+      </w:r>
+      <w:r>
+        <w:rPr>
+          <w:i/>
+          <w:iCs/>
+        </w:rPr>
+        <w:t>u</w:t>
+      </w:r>
+      <w:r>
+        <w:t>) {</w:t>
+      </w:r>
+    </w:p>
+    <w:p>
+      <w:r>
+        <w:t>            System.out.println(u);</w:t>
+      </w:r>
+    </w:p>
+    <w:p>
+      <w:r>
+        <w:t xml:space="preserve">        } catch (IOException </w:t>
+      </w:r>
+      <w:r>
+        <w:rPr>
+          <w:i/>
+          <w:iCs/>
+        </w:rPr>
+        <w:t>i</w:t>
+      </w:r>
+      <w:r>
+        <w:t>) {</w:t>
+      </w:r>
+    </w:p>
+    <w:p>
+      <w:r>
+        <w:t>            System.out.println(i);</w:t>
+      </w:r>
+    </w:p>
+    <w:p>
+      <w:r>
+        <w:t>        }</w:t>
+      </w:r>
+    </w:p>
+    <w:p>
+      <w:r>
+        <w:t>    }</w:t>
+      </w:r>
+    </w:p>
+    <w:p/>
+    <w:p>
+      <w:r>
+        <w:t xml:space="preserve">    String vernamDecrypt(String </w:t>
+      </w:r>
+      <w:r>
+        <w:rPr>
+          <w:i/>
+          <w:iCs/>
+        </w:rPr>
+        <w:t>ct</w:t>
+      </w:r>
+      <w:r>
+        <w:t xml:space="preserve">, String </w:t>
+      </w:r>
+      <w:r>
+        <w:rPr>
+          <w:i/>
+          <w:iCs/>
+        </w:rPr>
+        <w:t>k</w:t>
+      </w:r>
+      <w:r>
+        <w:t>) {</w:t>
+      </w:r>
+    </w:p>
+    <w:p>
+      <w:r>
+        <w:t xml:space="preserve">        StringBuilder pt = </w:t>
+      </w:r>
+      <w:r>
+        <w:rPr>
+          <w:b/>
+          <w:bCs/>
+        </w:rPr>
+        <w:t>new</w:t>
+      </w:r>
+      <w:r>
+        <w:t xml:space="preserve"> StringBuilder();</w:t>
+      </w:r>
+    </w:p>
+    <w:p>
+      <w:r>
+        <w:t>        for (</w:t>
+      </w:r>
+      <w:r>
+        <w:rPr>
+          <w:i/>
+          <w:iCs/>
+        </w:rPr>
+        <w:t>int</w:t>
+      </w:r>
+      <w:r>
+        <w:t xml:space="preserve"> i = 0; i &lt; </w:t>
+      </w:r>
+      <w:r>
+        <w:rPr>
+          <w:i/>
+          <w:iCs/>
+        </w:rPr>
+        <w:t>ct</w:t>
+      </w:r>
+      <w:r>
+        <w:t>.length(); i++) {</w:t>
+      </w:r>
+    </w:p>
+    <w:p>
+      <w:r>
+        <w:t xml:space="preserve">            </w:t>
+      </w:r>
+      <w:r>
+        <w:rPr>
+          <w:i/>
+          <w:iCs/>
+        </w:rPr>
+        <w:t>char</w:t>
+      </w:r>
+      <w:r>
+        <w:t xml:space="preserve"> cChar = </w:t>
+      </w:r>
+      <w:r>
+        <w:rPr>
+          <w:i/>
+          <w:iCs/>
+        </w:rPr>
+        <w:t>ct</w:t>
+      </w:r>
+      <w:r>
+        <w:t>.charAt(i);</w:t>
+      </w:r>
+    </w:p>
+    <w:p>
+      <w:r>
+        <w:t xml:space="preserve">            </w:t>
+      </w:r>
+      <w:r>
+        <w:rPr>
+          <w:i/>
+          <w:iCs/>
+        </w:rPr>
+        <w:t>char</w:t>
+      </w:r>
+      <w:r>
+        <w:t xml:space="preserve"> kChar = </w:t>
+      </w:r>
+      <w:r>
+        <w:rPr>
+          <w:i/>
+          <w:iCs/>
+        </w:rPr>
+        <w:t>k</w:t>
+      </w:r>
+      <w:r>
+        <w:t>.charAt(i);</w:t>
+      </w:r>
+    </w:p>
+    <w:p>
+      <w:r>
+        <w:t xml:space="preserve">            </w:t>
+      </w:r>
+      <w:r>
+        <w:rPr>
+          <w:i/>
+          <w:iCs/>
+        </w:rPr>
+        <w:t>int</w:t>
+      </w:r>
+      <w:r>
+        <w:t xml:space="preserve"> cc, kc;</w:t>
+      </w:r>
+    </w:p>
+    <w:p>
+      <w:r>
+        <w:t>            if (Character.isUpperCase(cChar)) {</w:t>
+      </w:r>
+    </w:p>
+    <w:p>
+      <w:r>
+        <w:t>                cc = (</w:t>
+      </w:r>
+      <w:r>
+        <w:rPr>
+          <w:i/>
+          <w:iCs/>
+        </w:rPr>
+        <w:t>int</w:t>
+      </w:r>
+      <w:r>
+        <w:t>) cChar - 'A';</w:t>
+      </w:r>
+    </w:p>
+    <w:p>
+      <w:r>
+        <w:t>            } else {</w:t>
+      </w:r>
+    </w:p>
+    <w:p>
+      <w:r>
+        <w:t>                cc = (</w:t>
+      </w:r>
+      <w:r>
+        <w:rPr>
+          <w:i/>
+          <w:iCs/>
+        </w:rPr>
+        <w:t>int</w:t>
+      </w:r>
+      <w:r>
+        <w:t>) cChar - 'a';</w:t>
+      </w:r>
+    </w:p>
+    <w:p>
+      <w:r>
+        <w:t>            }</w:t>
+      </w:r>
+    </w:p>
+    <w:p>
+      <w:r>
+        <w:t>            if (Character.isUpperCase(kChar)) {</w:t>
+      </w:r>
+    </w:p>
+    <w:p>
+      <w:r>
+        <w:t>                kc = (</w:t>
+      </w:r>
+      <w:r>
+        <w:rPr>
+          <w:i/>
+          <w:iCs/>
+        </w:rPr>
+        <w:t>int</w:t>
+      </w:r>
+      <w:r>
+        <w:t>) kChar - 'A';</w:t>
+      </w:r>
+    </w:p>
+    <w:p>
+      <w:r>
+        <w:t>            } else {</w:t>
+      </w:r>
+    </w:p>
+    <w:p>
+      <w:r>
+        <w:t>                kc = (</w:t>
+      </w:r>
+      <w:r>
+        <w:rPr>
+          <w:i/>
+          <w:iCs/>
+        </w:rPr>
+        <w:t>int</w:t>
+      </w:r>
+      <w:r>
+        <w:t>) kChar - 'a';</w:t>
+      </w:r>
+    </w:p>
+    <w:p>
+      <w:r>
+        <w:t>            }</w:t>
+      </w:r>
+    </w:p>
+    <w:p>
+      <w:r>
+        <w:t xml:space="preserve">            </w:t>
+      </w:r>
+      <w:r>
+        <w:rPr>
+          <w:i/>
+          <w:iCs/>
+        </w:rPr>
+        <w:t>int</w:t>
+      </w:r>
+      <w:r>
+        <w:t xml:space="preserve"> pc = (cc ^ kc);</w:t>
+      </w:r>
+    </w:p>
+    <w:p>
+      <w:r>
+        <w:t>            if (Character.isUpperCase(cChar)) {</w:t>
+      </w:r>
+    </w:p>
+    <w:p>
+      <w:r>
+        <w:t xml:space="preserve">                </w:t>
+      </w:r>
+      <w:r>
+        <w:rPr>
+          <w:i/>
+          <w:iCs/>
+        </w:rPr>
+        <w:t>char</w:t>
+      </w:r>
+      <w:r>
+        <w:t xml:space="preserve"> pChar = (</w:t>
+      </w:r>
+      <w:r>
+        <w:rPr>
+          <w:i/>
+          <w:iCs/>
+        </w:rPr>
+        <w:t>char</w:t>
+      </w:r>
+      <w:r>
+        <w:t>) (pc + 'A');</w:t>
+      </w:r>
+    </w:p>
+    <w:p>
+      <w:r>
+        <w:t>                pt.append(pChar);</w:t>
+      </w:r>
+    </w:p>
+    <w:p>
+      <w:r>
+        <w:lastRenderedPageBreak/>
+        <w:t>            } else {</w:t>
+      </w:r>
+    </w:p>
+    <w:p>
+      <w:r>
+        <w:t xml:space="preserve">                </w:t>
+      </w:r>
+      <w:r>
+        <w:rPr>
+          <w:i/>
+          <w:iCs/>
+        </w:rPr>
+        <w:t>char</w:t>
+      </w:r>
+      <w:r>
+        <w:t xml:space="preserve"> pChar = (</w:t>
+      </w:r>
+      <w:r>
+        <w:rPr>
+          <w:i/>
+          <w:iCs/>
+        </w:rPr>
+        <w:t>char</w:t>
+      </w:r>
+      <w:r>
+        <w:t>) (pc + 'a');</w:t>
+      </w:r>
+    </w:p>
+    <w:p>
+      <w:r>
+        <w:t>                pt.append(pChar);</w:t>
+      </w:r>
+    </w:p>
+    <w:p>
+      <w:r>
+        <w:t>            }</w:t>
+      </w:r>
+    </w:p>
+    <w:p>
+      <w:r>
+        <w:t>        }</w:t>
+      </w:r>
+    </w:p>
+    <w:p>
+      <w:r>
+        <w:t>        return pt.toString();</w:t>
+      </w:r>
+    </w:p>
+    <w:p>
+      <w:r>
+        <w:t>    }</w:t>
+      </w:r>
+    </w:p>
+    <w:p/>
+    <w:p>
+      <w:r>
+        <w:t xml:space="preserve">    public </w:t>
+      </w:r>
+      <w:r>
+        <w:rPr>
+          <w:i/>
+          <w:iCs/>
+        </w:rPr>
+        <w:t>void</w:t>
+      </w:r>
+      <w:r>
+        <w:t xml:space="preserve"> Work() {</w:t>
+      </w:r>
+    </w:p>
+    <w:p>
+      <w:r>
+        <w:t>        try {</w:t>
+      </w:r>
+    </w:p>
+    <w:p>
+      <w:r>
+        <w:t>            String k = input.readUTF();</w:t>
+      </w:r>
+    </w:p>
+    <w:p>
+      <w:r>
+        <w:t>            String ip = input.readUTF();</w:t>
+      </w:r>
+    </w:p>
+    <w:p>
+      <w:r>
+        <w:t>            String cts = vernamDecrypt(ip, k);</w:t>
+      </w:r>
+    </w:p>
+    <w:p>
+      <w:r>
+        <w:t>            System.out.println("The received encrypted text is: " + ip);</w:t>
+      </w:r>
+    </w:p>
+    <w:p>
+      <w:r>
+        <w:t>            System.out.println("The received key is: " + k);</w:t>
+      </w:r>
+    </w:p>
+    <w:p>
+      <w:r>
+        <w:t>            System.out.println("The decrypted text is: " + cts);</w:t>
+      </w:r>
+    </w:p>
+    <w:p>
+      <w:r>
+        <w:t>            output.writeUTF("Success from receiver!");</w:t>
+      </w:r>
+    </w:p>
+    <w:p>
+      <w:r>
+        <w:t>            input.close();</w:t>
+      </w:r>
+    </w:p>
+    <w:p>
+      <w:r>
+        <w:t>            output.close();</w:t>
+      </w:r>
+    </w:p>
+    <w:p>
+      <w:r>
+        <w:t xml:space="preserve">        } catch (IOException </w:t>
+      </w:r>
+      <w:r>
+        <w:rPr>
+          <w:i/>
+          <w:iCs/>
+        </w:rPr>
+        <w:t>i</w:t>
+      </w:r>
+      <w:r>
+        <w:t>) {</w:t>
+      </w:r>
+    </w:p>
+    <w:p>
+      <w:r>
+        <w:t>            System.out.println(i);</w:t>
+      </w:r>
+    </w:p>
+    <w:p>
+      <w:r>
+        <w:t>        }</w:t>
+      </w:r>
+    </w:p>
+    <w:p>
+      <w:r>
+        <w:t>    }</w:t>
+      </w:r>
+    </w:p>
+    <w:p/>
+    <w:p>
+      <w:r>
+        <w:t xml:space="preserve">    public static </w:t>
+      </w:r>
+      <w:r>
+        <w:rPr>
+          <w:i/>
+          <w:iCs/>
+        </w:rPr>
+        <w:t>void</w:t>
+      </w:r>
+      <w:r>
+        <w:t xml:space="preserve"> main(String[] </w:t>
+      </w:r>
+      <w:r>
+        <w:rPr>
+          <w:i/>
+          <w:iCs/>
+        </w:rPr>
+        <w:t>args</w:t>
+      </w:r>
+      <w:r>
+        <w:t>) {</w:t>
+      </w:r>
+    </w:p>
+    <w:p>
+      <w:r>
+        <w:t xml:space="preserve">        Vernam_Receiver vr = </w:t>
+      </w:r>
+      <w:r>
+        <w:rPr>
+          <w:b/>
+          <w:bCs/>
+        </w:rPr>
+        <w:t>new</w:t>
+      </w:r>
+      <w:r>
+        <w:t xml:space="preserve"> Vernam_Receiver(5431);</w:t>
+      </w:r>
+    </w:p>
+    <w:p>
+      <w:r>
+        <w:t>        vr.Work();</w:t>
+      </w:r>
+    </w:p>
+    <w:p>
+      <w:r>
+        <w:t>    }</w:t>
+      </w:r>
+    </w:p>
+    <w:p>
+      <w:r>
+        <w:t>}</w:t>
+      </w:r>
+    </w:p>
+    <w:p>
+      <w:pPr>
+        <w:pStyle w:val="Heading1"/>
+      </w:pPr>
+      <w:r>
+        <w:lastRenderedPageBreak/>
+        <w:t>Output (Vernam Cipher):</w:t>
+      </w:r>
+    </w:p>
+    <w:p>
+      <w:pPr>
+        <w:pStyle w:val="Heading2"/>
+      </w:pPr>
+      <w:r>
+        <w:t>Sender:</w:t>
+      </w:r>
+    </w:p>
+    <w:p>
+      <w:r>
+        <w:drawing>
+          <wp:inline distT="0" distB="0" distL="0" distR="0" wp14:anchorId="033E43EB" wp14:editId="65610615">
+            <wp:extent cx="5731510" cy="2945130"/>
+            <wp:effectExtent l="0" t="0" r="2540" b="7620"/>
+            <wp:docPr id="598685175" name="Picture 1" descr="A screenshot of a computer&#10;&#10;AI-generated content may be incorrect."/>
+            <wp:cNvGraphicFramePr>
+              <a:graphicFrameLocks xmlns:a="http://schemas.openxmlformats.org/drawingml/2006/main" noChangeAspect="1"/>
+            </wp:cNvGraphicFramePr>
+            <a:graphic xmlns:a="http://schemas.openxmlformats.org/drawingml/2006/main">
+              <a:graphicData uri="http://schemas.openxmlformats.org/drawingml/2006/picture">
+                <pic:pic xmlns:pic="http://schemas.openxmlformats.org/drawingml/2006/picture">
+                  <pic:nvPicPr>
+                    <pic:cNvPr id="598685175" name="Picture 1" descr="A screenshot of a computer&#10;&#10;AI-generated content may be incorrect."/>
+                    <pic:cNvPicPr/>
+                  </pic:nvPicPr>
+                  <pic:blipFill>
+                    <a:blip r:embed="rId11"/>
+                    <a:stretch>
+                      <a:fillRect/>
+                    </a:stretch>
+                  </pic:blipFill>
+                  <pic:spPr>
+                    <a:xfrm>
+                      <a:off x="0" y="0"/>
+                      <a:ext cx="5731510" cy="2945130"/>
+                    </a:xfrm>
+                    <a:prstGeom prst="rect">
+                      <a:avLst/>
+                    </a:prstGeom>
+                  </pic:spPr>
+                </pic:pic>
+              </a:graphicData>
+            </a:graphic>
+          </wp:inline>
+        </w:drawing>
+      </w:r>
+    </w:p>
+    <w:p>
+      <w:pPr>
+        <w:pStyle w:val="Heading2"/>
+      </w:pPr>
+      <w:r>
+        <w:t>Receiver:</w:t>
+      </w:r>
+    </w:p>
+    <w:p>
+      <w:r>
+        <w:drawing>
+          <wp:inline distT="0" distB="0" distL="0" distR="0" wp14:anchorId="29E15964" wp14:editId="2D3E8412">
+            <wp:extent cx="5731510" cy="2945130"/>
+            <wp:effectExtent l="0" t="0" r="2540" b="7620"/>
+            <wp:docPr id="1268687811" name="Picture 1" descr="A screenshot of a computer&#10;&#10;AI-generated content may be incorrect."/>
+            <wp:cNvGraphicFramePr>
+              <a:graphicFrameLocks xmlns:a="http://schemas.openxmlformats.org/drawingml/2006/main" noChangeAspect="1"/>
+            </wp:cNvGraphicFramePr>
+            <a:graphic xmlns:a="http://schemas.openxmlformats.org/drawingml/2006/main">
+              <a:graphicData uri="http://schemas.openxmlformats.org/drawingml/2006/picture">
+                <pic:pic xmlns:pic="http://schemas.openxmlformats.org/drawingml/2006/picture">
+                  <pic:nvPicPr>
+                    <pic:cNvPr id="1268687811" name="Picture 1" descr="A screenshot of a computer&#10;&#10;AI-generated content may be incorrect."/>
+                    <pic:cNvPicPr/>
+                  </pic:nvPicPr>
+                  <pic:blipFill>
+                    <a:blip r:embed="rId12"/>
+                    <a:stretch>
+                      <a:fillRect/>
+                    </a:stretch>
+                  </pic:blipFill>
+                  <pic:spPr>
+                    <a:xfrm>
+                      <a:off x="0" y="0"/>
+                      <a:ext cx="5731510" cy="2945130"/>
+                    </a:xfrm>
+                    <a:prstGeom prst="rect">
+                      <a:avLst/>
+                    </a:prstGeom>
+                  </pic:spPr>
+                </pic:pic>
+              </a:graphicData>
+            </a:graphic>
+          </wp:inline>
+        </w:drawing>
+      </w:r>
+    </w:p>
     <w:sectPr>
       <w:pgSz w:w="11906" w:h="16838"/>
       <w:pgMar w:top="1440" w:right="1440" w:bottom="1440" w:left="1440" w:header="708" w:footer="708" w:gutter="0"/>
@@ -2402,7 +5616,6 @@
   <w:style w:type="character" w:default="1" w:styleId="DefaultParagraphFont">
     <w:name w:val="Default Paragraph Font"/>
     <w:uiPriority w:val="1"/>
-    <w:semiHidden/>
     <w:unhideWhenUsed/>
   </w:style>
   <w:style w:type="table" w:default="1" w:styleId="TableNormal">
@@ -2805,6 +6018,23 @@
 </file>
 
 <file path=customXml/item1.xml><?xml version="1.0" encoding="utf-8"?>
+<?mso-contentType ?>
+<FormTemplates xmlns="http://schemas.microsoft.com/sharepoint/v3/contenttype/forms">
+  <Display>DocumentLibraryForm</Display>
+  <Edit>DocumentLibraryForm</Edit>
+  <New>DocumentLibraryForm</New>
+</FormTemplates>
+</file>
+
+<file path=customXml/item2.xml><?xml version="1.0" encoding="utf-8"?>
+<p:properties xmlns:p="http://schemas.microsoft.com/office/2006/metadata/properties" xmlns:xsi="http://www.w3.org/2001/XMLSchema-instance" xmlns:pc="http://schemas.microsoft.com/office/infopath/2007/PartnerControls">
+  <documentManagement>
+    <ReferenceId xmlns="7d434318-ea68-484d-9b90-48e8ff59ee73" xsi:nil="true"/>
+  </documentManagement>
+</p:properties>
+</file>
+
+<file path=customXml/item3.xml><?xml version="1.0" encoding="utf-8"?>
 <ct:contentTypeSchema xmlns:ct="http://schemas.microsoft.com/office/2006/metadata/contentType" xmlns:ma="http://schemas.microsoft.com/office/2006/metadata/properties/metaAttributes" ct:_="" ma:_="" ma:contentTypeName="Document" ma:contentTypeID="0x01010016A77D0581D4CF4BBDA8A43453351EEE" ma:contentTypeVersion="1" ma:contentTypeDescription="Create a new document." ma:contentTypeScope="" ma:versionID="588eae25f797714dab30afb38b1467bb">
   <xsd:schema xmlns:xsd="http://www.w3.org/2001/XMLSchema" xmlns:xs="http://www.w3.org/2001/XMLSchema" xmlns:p="http://schemas.microsoft.com/office/2006/metadata/properties" xmlns:ns2="7d434318-ea68-484d-9b90-48e8ff59ee73" targetNamespace="http://schemas.microsoft.com/office/2006/metadata/properties" ma:root="true" ma:fieldsID="9820101d4f4e47628ef13eef411db721" ns2:_="">
     <xsd:import namespace="7d434318-ea68-484d-9b90-48e8ff59ee73"/>
@@ -2930,24 +6160,25 @@
 </ct:contentTypeSchema>
 </file>
 
-<file path=customXml/item2.xml><?xml version="1.0" encoding="utf-8"?>
-<p:properties xmlns:p="http://schemas.microsoft.com/office/2006/metadata/properties" xmlns:xsi="http://www.w3.org/2001/XMLSchema-instance" xmlns:pc="http://schemas.microsoft.com/office/infopath/2007/PartnerControls">
-  <documentManagement>
-    <ReferenceId xmlns="7d434318-ea68-484d-9b90-48e8ff59ee73" xsi:nil="true"/>
-  </documentManagement>
-</p:properties>
+<file path=customXml/itemProps1.xml><?xml version="1.0" encoding="utf-8"?>
+<ds:datastoreItem xmlns:ds="http://schemas.openxmlformats.org/officeDocument/2006/customXml" ds:itemID="{5DBD1E01-457F-4917-A8A5-5F7A84E8FDC3}">
+  <ds:schemaRefs>
+    <ds:schemaRef ds:uri="http://schemas.microsoft.com/sharepoint/v3/contenttype/forms"/>
+  </ds:schemaRefs>
+</ds:datastoreItem>
 </file>
 
-<file path=customXml/item3.xml><?xml version="1.0" encoding="utf-8"?>
-<?mso-contentType ?>
-<FormTemplates xmlns="http://schemas.microsoft.com/sharepoint/v3/contenttype/forms">
-  <Display>DocumentLibraryForm</Display>
-  <Edit>DocumentLibraryForm</Edit>
-  <New>DocumentLibraryForm</New>
-</FormTemplates>
+<file path=customXml/itemProps2.xml><?xml version="1.0" encoding="utf-8"?>
+<ds:datastoreItem xmlns:ds="http://schemas.openxmlformats.org/officeDocument/2006/customXml" ds:itemID="{E4AB7886-41DD-4EDC-825B-CB32C0633191}">
+  <ds:schemaRefs>
+    <ds:schemaRef ds:uri="http://schemas.microsoft.com/office/2006/metadata/properties"/>
+    <ds:schemaRef ds:uri="http://schemas.microsoft.com/office/infopath/2007/PartnerControls"/>
+    <ds:schemaRef ds:uri="7d434318-ea68-484d-9b90-48e8ff59ee73"/>
+  </ds:schemaRefs>
+</ds:datastoreItem>
 </file>
 
-<file path=customXml/itemProps1.xml><?xml version="1.0" encoding="utf-8"?>
+<file path=customXml/itemProps3.xml><?xml version="1.0" encoding="utf-8"?>
 <ds:datastoreItem xmlns:ds="http://schemas.openxmlformats.org/officeDocument/2006/customXml" ds:itemID="{3063C5FB-61D2-4522-91D9-4FCC2B80A578}">
   <ds:schemaRefs>
     <ds:schemaRef ds:uri="http://schemas.microsoft.com/office/2006/metadata/contentType"/>
@@ -2963,22 +6194,4 @@
     <ds:schemaRef ds:uri="http://schemas.microsoft.com/internal/obd"/>
   </ds:schemaRefs>
 </ds:datastoreItem>
-</file>
-
-<file path=customXml/itemProps2.xml><?xml version="1.0" encoding="utf-8"?>
-<ds:datastoreItem xmlns:ds="http://schemas.openxmlformats.org/officeDocument/2006/customXml" ds:itemID="{E4AB7886-41DD-4EDC-825B-CB32C0633191}">
-  <ds:schemaRefs>
-    <ds:schemaRef ds:uri="http://schemas.microsoft.com/office/2006/metadata/properties"/>
-    <ds:schemaRef ds:uri="http://schemas.microsoft.com/office/infopath/2007/PartnerControls"/>
-    <ds:schemaRef ds:uri="7d434318-ea68-484d-9b90-48e8ff59ee73"/>
-  </ds:schemaRefs>
-</ds:datastoreItem>
-</file>
-
-<file path=customXml/itemProps3.xml><?xml version="1.0" encoding="utf-8"?>
-<ds:datastoreItem xmlns:ds="http://schemas.openxmlformats.org/officeDocument/2006/customXml" ds:itemID="{5DBD1E01-457F-4917-A8A5-5F7A84E8FDC3}">
-  <ds:schemaRefs>
-    <ds:schemaRef ds:uri="http://schemas.microsoft.com/sharepoint/v3/contenttype/forms"/>
-  </ds:schemaRefs>
-</ds:datastoreItem>
 </file>
</xml_diff>